<commit_message>
Simplify SAFE worksheet and check against YC reference forms
Co-Authored-By: Claude Opus 5.5 <noreply@anthropic.com>
Claude-Session: https://claude.ai/code/session_0131d3R7MWmwtEPeZdc3GrMD
</commit_message>
<xml_diff>
--- a/SAFE Exercise - 4. Group Worksheet (2026) - Completed.docx
+++ b/SAFE Exercise - 4. Group Worksheet (2026) - Completed.docx
@@ -386,14 +386,14 @@
                 <w:sz w:val="20"/>
                 <w:szCs w:val="20"/>
               </w:rPr>
-              <w:t xml:space="preserve">The SAFE is not the standard YC SAFE.</w:t>
-            </w:r>
-            <w:r>
-              <w:rPr>
-                <w:sz w:val="20"/>
-                <w:szCs w:val="20"/>
-              </w:rPr>
-              <w:t xml:space="preserve"> Dana's email calls it "plain vanilla," and the SAFE itself says neither party has modified the YC form. That statement is false (see rows 2-5), so Alex cannot skip the SAFE. The false "unmodified" statement also gives us leverage: we are asking Northvane to make the document match what it says it is.</w:t>
+              <w:t xml:space="preserve">The SAFE is NOT the standard YC SAFE.</w:t>
+            </w:r>
+            <w:r>
+              <w:rPr>
+                <w:sz w:val="20"/>
+                <w:szCs w:val="20"/>
+              </w:rPr>
+              <w:t xml:space="preserve"> Compared line by line with the YC cap-only form, it has three changes (rows 2-4). It also says "neither party has modified the form," which is false. Alex can't skip it.</w:t>
             </w:r>
           </w:p>
         </w:tc>
@@ -419,7 +419,7 @@
                 <w:sz w:val="20"/>
                 <w:szCs w:val="20"/>
               </w:rPr>
-              <w:t xml:space="preserve">SAFE, preamble (2nd paragraph); Dana's email</w:t>
+              <w:t xml:space="preserve">SAFE, opening paragraph; Dana's email</w:t>
             </w:r>
           </w:p>
         </w:tc>
@@ -502,14 +502,14 @@
                 <w:sz w:val="20"/>
                 <w:szCs w:val="20"/>
               </w:rPr>
-              <w:t xml:space="preserve">2x Cash-Out Amount.</w:t>
-            </w:r>
-            <w:r>
-              <w:rPr>
-                <w:sz w:val="20"/>
-                <w:szCs w:val="20"/>
-              </w:rPr>
-              <w:t xml:space="preserve"> The YC form pays 1x. Here Northvane takes $3M (2x its $1.5M) before common in any sale, IPO or wind-down, so it converts only above a ~$50M exit (YC form: $25M). In a $10M sale, money paid to SAFE holders before common goes from ~$2.9M to ~$4.4M, and common drops from ~$7.1M to ~$5.6M. That costs Alex ~$800K and Priya ~$600K. It also conflicts with §1(d), which says the SAFE works like "standard non-participating Preferred Stock." And because it ranks equally with the other SAFEs, it shrinks what Bramblewood, the angels and the 2025 SAFE holders get in a fire sale.</w:t>
+              <w:t xml:space="preserve">2x payout instead of 1x.</w:t>
+            </w:r>
+            <w:r>
+              <w:rPr>
+                <w:sz w:val="20"/>
+                <w:szCs w:val="20"/>
+              </w:rPr>
+              <w:t xml:space="preserve"> In a sale or shutdown, Northvane gets $3M (twice its $1.5M) before the founders get anything. Example: in a $10M sale, Alex gets about $800K less and Priya about $600K less.</w:t>
             </w:r>
           </w:p>
         </w:tc>
@@ -535,7 +535,7 @@
                 <w:sz w:val="20"/>
                 <w:szCs w:val="20"/>
               </w:rPr>
-              <w:t xml:space="preserve">SAFE §1(b) (Liquidity Event), §1(c) (Dissolution Event), §1(d)</w:t>
+              <w:t xml:space="preserve">SAFE §1(b), §1(c)</w:t>
             </w:r>
           </w:p>
         </w:tc>
@@ -618,14 +618,14 @@
                 <w:sz w:val="20"/>
                 <w:szCs w:val="20"/>
               </w:rPr>
-              <w:t xml:space="preserve">A one-word change: at the cap, Northvane converts into Standard Preferred Stock instead of Safe Preferred Stock.</w:t>
-            </w:r>
-            <w:r>
-              <w:rPr>
-                <w:sz w:val="20"/>
-                <w:szCs w:val="20"/>
-              </w:rPr>
-              <w:t xml:space="preserve"> Standard Preferred's per-share liquidation preference, conversion price and dividend are set at the Series A price, not the lower Safe Price. If the Series A is priced at 2x the Safe Price (roughly a $50M post-money), Northvane's $1.5M gets a ~$3M preference. At 3x it gets ~$4.5M. The better the Series A goes, the bigger Northvane's hidden preference.</w:t>
+              <w:t xml:space="preserve">Hidden one-word change: "Standard" instead of "Safe" Preferred.</w:t>
+            </w:r>
+            <w:r>
+              <w:rPr>
+                <w:sz w:val="20"/>
+                <w:szCs w:val="20"/>
+              </w:rPr>
+              <w:t xml:space="preserve"> When the SAFE converts in the Series A, Northvane's preferred stock gets a payout preference based on the Series A price instead of its own lower price. If the Series A is at 2x the cap, Northvane's $1.5M carries a ~$3M preference.</w:t>
             </w:r>
           </w:p>
         </w:tc>
@@ -651,7 +651,7 @@
                 <w:sz w:val="20"/>
                 <w:szCs w:val="20"/>
               </w:rPr>
-              <w:t xml:space="preserve">SAFE §1(a), clause (2); compare definition of "Safe Preferred Stock" (§2)</w:t>
+              <w:t xml:space="preserve">SAFE §1(a), clause (2)</w:t>
             </w:r>
           </w:p>
         </w:tc>
@@ -742,14 +742,14 @@
                 <w:sz w:val="20"/>
                 <w:szCs w:val="20"/>
               </w:rPr>
-              <w:t xml:space="preserve">$5M minimum for an "Equity Financing."</w:t>
-            </w:r>
-            <w:r>
-              <w:rPr>
-                <w:sz w:val="20"/>
-                <w:szCs w:val="20"/>
-              </w:rPr>
-              <w:t xml:space="preserve"> The YC form has no minimum. If the next priced round is a $3-4M seed, Bramblewood's, the angels' and the 2025 SAFEs convert but Northvane's does not. Its 2x preference, MFN and pre-financing vetoes (§8, §9(d)) stay alive, which lets Northvane hold up the round. The side letter's pro rata, Major Investor and conversion rights all use this definition.</w:t>
+              <w:t xml:space="preserve">$5M minimum round.</w:t>
+            </w:r>
+            <w:r>
+              <w:rPr>
+                <w:sz w:val="20"/>
+                <w:szCs w:val="20"/>
+              </w:rPr>
+              <w:t xml:space="preserve"> The YC form converts in any priced round. Here, a round under $5M converts everyone except Northvane, which keeps its 2x payout and vetoes.</w:t>
             </w:r>
           </w:p>
         </w:tc>
@@ -775,7 +775,7 @@
                 <w:sz w:val="20"/>
                 <w:szCs w:val="20"/>
               </w:rPr>
-              <w:t xml:space="preserve">SAFE §2, definition of "Equity Financing"; Side letter §§1, 3, 8</w:t>
+              <w:t xml:space="preserve">SAFE §2, "Equity Financing"</w:t>
             </w:r>
           </w:p>
         </w:tc>
@@ -858,14 +858,14 @@
                 <w:sz w:val="20"/>
                 <w:szCs w:val="20"/>
               </w:rPr>
-              <w:t xml:space="preserve">The YC carve-out letting the Company assign the SAFE when it reincorporates has been deleted.</w:t>
-            </w:r>
-            <w:r>
-              <w:rPr>
-                <w:sz w:val="20"/>
-                <w:szCs w:val="20"/>
-              </w:rPr>
-              <w:t xml:space="preserve"> Minor, but it is another undisclosed change from the form.</w:t>
+              <w:t xml:space="preserve">Founders lose their vesting.</w:t>
+            </w:r>
+            <w:r>
+              <w:rPr>
+                <w:sz w:val="20"/>
+                <w:szCs w:val="20"/>
+              </w:rPr>
+              <w:t xml:space="preserve"> Alex and Priya are about 52% vested. This resets both to 0%, re-vesting over 4 more years (Alex ~2.34M shares, Priya ~1.82M shares put back at risk). Their acceleration on a sale also becomes "double trigger": it only applies if they are also fired. This is Priya's concern.</w:t>
             </w:r>
           </w:p>
         </w:tc>
@@ -891,7 +891,7 @@
                 <w:sz w:val="20"/>
                 <w:szCs w:val="20"/>
               </w:rPr>
-              <w:t xml:space="preserve">SAFE §5(d)</w:t>
+              <w:t xml:space="preserve">Side letter §9(b)</w:t>
             </w:r>
           </w:p>
         </w:tc>
@@ -974,14 +974,14 @@
                 <w:sz w:val="20"/>
                 <w:szCs w:val="20"/>
               </w:rPr>
-              <w:t xml:space="preserve">Northvane controls amendments to the whole $25M-cap SAFE group.</w:t>
-            </w:r>
-            <w:r>
-              <w:rPr>
-                <w:sz w:val="20"/>
-                <w:szCs w:val="20"/>
-              </w:rPr>
-              <w:t xml:space="preserve"> It holds $1.5M of $2.5M (60%), so under the SAFE's majority-in-interest clause Northvane plus the Company can amend Bramblewood's and the angels' SAFEs. Side letter §20(b) also gives Northvane a veto over amendments to any other SAFE, overriding those SAFEs' own terms.</w:t>
+              <w:t xml:space="preserve">Founders sign personally.</w:t>
+            </w:r>
+            <w:r>
+              <w:rPr>
+                <w:sz w:val="20"/>
+                <w:szCs w:val="20"/>
+              </w:rPr>
+              <w:t xml:space="preserve"> We represent the company, not Alex and Priya. They should get their own advice on §6(b) and §9(b). Consider a protective 83(b) election.</w:t>
             </w:r>
           </w:p>
         </w:tc>
@@ -1007,7 +1007,7 @@
                 <w:sz w:val="20"/>
                 <w:szCs w:val="20"/>
               </w:rPr>
-              <w:t xml:space="preserve">SAFE §5(a); Side letter §20(b)</w:t>
+              <w:t xml:space="preserve">Side letter signature page; §6(b), §9(b)</w:t>
             </w:r>
           </w:p>
         </w:tc>
@@ -1090,14 +1090,14 @@
                 <w:sz w:val="20"/>
                 <w:szCs w:val="20"/>
               </w:rPr>
-              <w:t xml:space="preserve">Founder re-vesting and double trigger.</w:t>
-            </w:r>
-            <w:r>
-              <w:rPr>
-                <w:sz w:val="20"/>
-                <w:szCs w:val="20"/>
-              </w:rPr>
-              <w:t xml:space="preserve"> All of each founder's ~52%-vested shares become unvested again and re-vest monthly over four years starting October 2026. Alex (~2.34M vested shares) and Priya (~1.82M) put those shares back at risk of repurchase. Full vesting moves from Sept. 2028 to Oct. 2030. Single-trigger acceleration is replaced with double trigger. The founders must sign the amendment within 30 days. This answers Priya's question.</w:t>
+              <w:t xml:space="preserve">Northvane gets vetoes before the Series A.</w:t>
+            </w:r>
+            <w:r>
+              <w:rPr>
+                <w:sz w:val="20"/>
+                <w:szCs w:val="20"/>
+              </w:rPr>
+              <w:t xml:space="preserve"> Without its consent the company can't sell itself, do a small priced round, add authorized shares, or grow the option pool.</w:t>
             </w:r>
           </w:p>
         </w:tc>
@@ -1123,7 +1123,7 @@
                 <w:sz w:val="20"/>
                 <w:szCs w:val="20"/>
               </w:rPr>
-              <w:t xml:space="preserve">Side letter §9(b); founder signature block ("solely for purposes of Section 6(b) and Section 9(b)")</w:t>
+              <w:t xml:space="preserve">Side letter §8, §9(d)</w:t>
             </w:r>
           </w:p>
         </w:tc>
@@ -1206,14 +1206,14 @@
                 <w:sz w:val="20"/>
                 <w:szCs w:val="20"/>
               </w:rPr>
-              <w:t xml:space="preserve">Who we represent / founders sign personally.</w:t>
-            </w:r>
-            <w:r>
-              <w:rPr>
-                <w:sz w:val="20"/>
-                <w:szCs w:val="20"/>
-              </w:rPr>
-              <w:t xml:space="preserve"> We represent the Company, not Alex and Priya. §6(b) (voting for a Northvane board designee) and §9(b) (re-vesting) bind them as individuals, so they should get independent advice or a conflict waiver. Re-vesting also raises an 83(b) question. Consider a protective 83(b) election within 30 days of the amendment.</w:t>
+              <w:t xml:space="preserve">Northvane controls the other SAFEs.</w:t>
+            </w:r>
+            <w:r>
+              <w:rPr>
+                <w:sz w:val="20"/>
+                <w:szCs w:val="20"/>
+              </w:rPr>
+              <w:t xml:space="preserve"> It holds 60% of the $25M-cap SAFEs, so it can approve changes to Bramblewood's and the angels' SAFEs, and the side letter gives it a veto over any change to them.</w:t>
             </w:r>
           </w:p>
         </w:tc>
@@ -1239,7 +1239,7 @@
                 <w:sz w:val="20"/>
                 <w:szCs w:val="20"/>
               </w:rPr>
-              <w:t xml:space="preserve">Side letter §6(b), §9(b), signature page</w:t>
+              <w:t xml:space="preserve">SAFE §5(a); Side letter §20(b)</w:t>
             </w:r>
           </w:p>
         </w:tc>
@@ -1322,14 +1322,14 @@
                 <w:sz w:val="20"/>
                 <w:szCs w:val="20"/>
               </w:rPr>
-              <w:t xml:space="preserve">Vetoes before the Series A.</w:t>
-            </w:r>
-            <w:r>
-              <w:rPr>
-                <w:sz w:val="20"/>
-                <w:szCs w:val="20"/>
-              </w:rPr>
-              <w:t xml:space="preserve"> Without Northvane's consent the Company cannot create a new class of stock (so no priced preferred round under $5M), increase authorized shares, or sell material assets "whether by merger" (a veto over any M&amp;A). It also cannot amend the equity plan or any award, which blocks increasing the option pool. Northvane gets these vetoes as a SAFE holder that owns no stock. Bramblewood asked for none of them.</w:t>
+              <w:t xml:space="preserve">Pro rata rights go far beyond the YC pro rata letter.</w:t>
+            </w:r>
+            <w:r>
+              <w:rPr>
+                <w:sz w:val="20"/>
+                <w:szCs w:val="20"/>
+              </w:rPr>
+              <w:t xml:space="preserve"> The YC letter covers only the next priced round, ends there, and uses all shares including the option pool as the base. Northvane's covers every future round forever (including bridge SAFEs) and leaves the option pool out of the base, which makes its share bigger. It also gives a 20-day wait before closing and advance notice of any term sheet.</w:t>
             </w:r>
           </w:p>
         </w:tc>
@@ -1355,7 +1355,7 @@
                 <w:sz w:val="20"/>
                 <w:szCs w:val="20"/>
               </w:rPr>
-              <w:t xml:space="preserve">Side letter §8, §9(d)</w:t>
+              <w:t xml:space="preserve">Side letter §1; compare YC Pro Rata Side Letter</w:t>
             </w:r>
           </w:p>
         </w:tc>
@@ -1438,14 +1438,14 @@
                 <w:sz w:val="20"/>
                 <w:szCs w:val="20"/>
               </w:rPr>
-              <w:t xml:space="preserve">Limits on employee equity and IP agreements.</w:t>
-            </w:r>
-            <w:r>
-              <w:rPr>
-                <w:sz w:val="20"/>
-                <w:szCs w:val="20"/>
-              </w:rPr>
-              <w:t xml:space="preserve"> Every grant must have 4-year vesting with a 1-year cliff and a company ROFR. That leaves no flexibility for advisors (usually 2 years), hires who negotiate acceleration, or consultants. The rep that every founder, employee and consultant has signed an IP assignment "in a form acceptable to Investor" may be untrue today and needs diligence.</w:t>
+              <w:t xml:space="preserve">Broad MFN.</w:t>
+            </w:r>
+            <w:r>
+              <w:rPr>
+                <w:sz w:val="20"/>
+                <w:szCs w:val="20"/>
+              </w:rPr>
+              <w:t xml:space="preserve"> Northvane can copy any better term given to any later investor, including stacking a discount on top of its cap.</w:t>
             </w:r>
           </w:p>
         </w:tc>
@@ -1471,7 +1471,7 @@
                 <w:sz w:val="20"/>
                 <w:szCs w:val="20"/>
               </w:rPr>
-              <w:t xml:space="preserve">Side letter §9(a), §9(c)</w:t>
+              <w:t xml:space="preserve">Side letter §2</w:t>
             </w:r>
           </w:p>
         </w:tc>
@@ -1554,14 +1554,14 @@
                 <w:sz w:val="20"/>
                 <w:szCs w:val="20"/>
               </w:rPr>
-              <w:t xml:space="preserve">Pro rata rights that never expire and cover everything.</w:t>
-            </w:r>
-            <w:r>
-              <w:rPr>
-                <w:sz w:val="20"/>
-                <w:szCs w:val="20"/>
-              </w:rPr>
-              <w:t xml:space="preserve"> They cover every future financing, including bridge SAFEs and notes, at the lowest price. The 20-day exercise period slows any closing when we have 4 months of runway. Term-sheet notice tips Northvane off to competing offers. The rights survive the Series A unless Northvane alone can waive the replacement right. The exclusion covers only securities outstanding at signing, which arguably gives Northvane a pro rata right in Bramblewood's and the angels' concurrent SAFEs.</w:t>
+              <w:t xml:space="preserve">Board observer and a promised board seat.</w:t>
+            </w:r>
+            <w:r>
+              <w:rPr>
+                <w:sz w:val="20"/>
+                <w:szCs w:val="20"/>
+              </w:rPr>
+              <w:t xml:space="preserve"> Northvane gets an observer for as long as it holds anything, and a board seat in the Series A. It is also free to invest in competitors and can never be labeled a "Competitor," so it sees board materials while it can back rivals.</w:t>
             </w:r>
           </w:p>
         </w:tc>
@@ -1587,7 +1587,7 @@
                 <w:sz w:val="20"/>
                 <w:szCs w:val="20"/>
               </w:rPr>
-              <w:t xml:space="preserve">Side letter §1(a)-(e) (esp. §1(d) "New Securities" exclusion (ii), §1(e) survival)</w:t>
+              <w:t xml:space="preserve">Side letter §6, §7(b), §15</w:t>
             </w:r>
           </w:p>
         </w:tc>
@@ -1670,14 +1670,14 @@
                 <w:sz w:val="20"/>
                 <w:szCs w:val="20"/>
               </w:rPr>
-              <w:t xml:space="preserve">Broad MFN.</w:t>
-            </w:r>
-            <w:r>
-              <w:rPr>
-                <w:sz w:val="20"/>
-                <w:szCs w:val="20"/>
-              </w:rPr>
-              <w:t xml:space="preserve"> It covers any later convertible security (arguably including convertible preferred stock) and any side letter. Northvane can pick whichever terms are "preferable or additional," for example adding a bridge discount on top of its cap. The MFN lasts until conversion, and with the $5M floor that may be a long time.</w:t>
+              <w:t xml:space="preserve">Heavy reporting for a 5-person company.</w:t>
+            </w:r>
+            <w:r>
+              <w:rPr>
+                <w:sz w:val="20"/>
+                <w:szCs w:val="20"/>
+              </w:rPr>
+              <w:t xml:space="preserve"> Monthly budgets, customer data, pitch decks, and advance drafts of any sale documents. The basic financials and cap table are fine.</w:t>
             </w:r>
           </w:p>
         </w:tc>
@@ -1703,7 +1703,7 @@
                 <w:sz w:val="20"/>
                 <w:szCs w:val="20"/>
               </w:rPr>
-              <w:t xml:space="preserve">Side letter §2(a)-(c)</w:t>
+              <w:t xml:space="preserve">Side letter §4, §5</w:t>
             </w:r>
           </w:p>
         </w:tc>
@@ -1786,14 +1786,14 @@
                 <w:sz w:val="20"/>
                 <w:szCs w:val="20"/>
               </w:rPr>
-              <w:t xml:space="preserve">Major Investor status regardless of thresholds, plus rights equal to the best granted to any Series A investor.</w:t>
-            </w:r>
-            <w:r>
-              <w:rPr>
-                <w:sz w:val="20"/>
-                <w:szCs w:val="20"/>
-              </w:rPr>
-              <w:t xml:space="preserve"> This is an MFN built into the Series A, and the Series A lead will push back.</w:t>
+              <w:t xml:space="preserve">The side letter overrides everything and never ends.</w:t>
+            </w:r>
+            <w:r>
+              <w:rPr>
+                <w:sz w:val="20"/>
+                <w:szCs w:val="20"/>
+              </w:rPr>
+              <w:t xml:space="preserve"> It claims to beat the charter and the future Series A documents, and Northvane can transfer it to anyone. The YC letter ends at the Series A and can't be assigned without consent.</w:t>
             </w:r>
           </w:p>
         </w:tc>
@@ -1819,7 +1819,7 @@
                 <w:sz w:val="20"/>
                 <w:szCs w:val="20"/>
               </w:rPr>
-              <w:t xml:space="preserve">Side letter §3, §3(a)</w:t>
+              <w:t xml:space="preserve">Side letter §19, §20(a), §20(c)</w:t>
             </w:r>
           </w:p>
         </w:tc>
@@ -1902,14 +1902,14 @@
                 <w:sz w:val="20"/>
                 <w:szCs w:val="20"/>
               </w:rPr>
-              <w:t xml:space="preserve">Board observer and board seat.</w:t>
-            </w:r>
-            <w:r>
-              <w:rPr>
-                <w:sz w:val="20"/>
-                <w:szCs w:val="20"/>
-              </w:rPr>
-              <w:t xml:space="preserve"> The observer right lasts as long as Northvane holds anything, and the exclusions are narrow (nothing for competitively sensitive information or conflicts). Combined with §15 (Northvane is free to fund competitors) and §7(b) (Northvane can never be treated as a "Competitor"), that is a real confidentiality risk in Dana's own sector. §6(b) also locks in a Northvane director (1 of 3 on today's two-founder board) in the Series A before a lead is even at the table.</w:t>
+              <w:t xml:space="preserve">The other investors aren't told.</w:t>
+            </w:r>
+            <w:r>
+              <w:rPr>
+                <w:sz w:val="20"/>
+                <w:szCs w:val="20"/>
+              </w:rPr>
+              <w:t xml:space="preserve"> Bramblewood and the angels rank equally with Northvane's hidden 2x payout, and the side letter bars the company from telling them. That creates securities-fraud risk.</w:t>
             </w:r>
           </w:p>
         </w:tc>
@@ -1935,7 +1935,7 @@
                 <w:sz w:val="20"/>
                 <w:szCs w:val="20"/>
               </w:rPr>
-              <w:t xml:space="preserve">Side letter §6(a)-(c), §7(b), §15</w:t>
+              <w:t xml:space="preserve">Side letter §18(b), §14(b)</w:t>
             </w:r>
           </w:p>
         </w:tc>
@@ -2018,14 +2018,14 @@
                 <w:sz w:val="20"/>
                 <w:szCs w:val="20"/>
               </w:rPr>
-              <w:t xml:space="preserve">Information rights are heavy for a five-person company.</w:t>
-            </w:r>
-            <w:r>
-              <w:rPr>
-                <w:sz w:val="20"/>
-                <w:szCs w:val="20"/>
-              </w:rPr>
-              <w:t xml:space="preserve"> They include monthly budgets, cohort data, customer pitch decks, cap-table platform access, and drafts of any M&amp;A documents "reasonably in advance," which together with the §8(iv) veto gives Northvane leverage in a sale. They also overlap with §5(b)-(c). The basic annual and quarterly financials and cap table (§4(a)-(c), (g)) are fine.</w:t>
+              <w:t xml:space="preserve">Smaller items.</w:t>
+            </w:r>
+            <w:r>
+              <w:rPr>
+                <w:sz w:val="20"/>
+                <w:szCs w:val="20"/>
+              </w:rPr>
+              <w:t xml:space="preserve"> Strict vesting rules for all employee grants (§9(a)). Broad permits rep (§11). Undefined "customary" anti-dilution (§7(a)). The company pays $10K + $5K of Northvane's legal fees (§17). Board approval is needed before signing (§14(a)).</w:t>
             </w:r>
           </w:p>
         </w:tc>
@@ -2051,7 +2051,7 @@
                 <w:sz w:val="20"/>
                 <w:szCs w:val="20"/>
               </w:rPr>
-              <w:t xml:space="preserve">Side letter §4(d)-(i), §5(b)-(c)</w:t>
+              <w:t xml:space="preserve">Side letter §7(a), §9(a), §11, §14(a), §17</w:t>
             </w:r>
           </w:p>
         </w:tc>
@@ -2134,14 +2134,14 @@
                 <w:sz w:val="20"/>
                 <w:szCs w:val="20"/>
               </w:rPr>
-              <w:t xml:space="preserve">The side letter overrides everything and lasts indefinitely.</w:t>
-            </w:r>
-            <w:r>
-              <w:rPr>
-                <w:sz w:val="20"/>
-                <w:szCs w:val="20"/>
-              </w:rPr>
-              <w:t xml:space="preserve"> It claims to override the charter, the bylaws and future Series A documents, and it is never superseded. A contract cannot override a Delaware charter, and Series A investors will insist this be cleaned up. It survives until Northvane holds nothing (the YC pro rata letter ends at the Equity Financing). Northvane can assign it freely without consent, unlike the SAFE.</w:t>
+              <w:t xml:space="preserve">Don't rush for Monday.</w:t>
+            </w:r>
+            <w:r>
+              <w:rPr>
+                <w:sz w:val="20"/>
+                <w:szCs w:val="20"/>
+              </w:rPr>
+              <w:t xml:space="preserve"> That date serves Dana's LP meeting. Bramblewood offered the same $25M cap on clean YC terms, which gives Alex leverage.</w:t>
             </w:r>
           </w:p>
         </w:tc>
@@ -2167,703 +2167,7 @@
                 <w:sz w:val="20"/>
                 <w:szCs w:val="20"/>
               </w:rPr>
-              <w:t xml:space="preserve">Side letter §19, §20(a)-(c), §20(h)</w:t>
-            </w:r>
-          </w:p>
-        </w:tc>
-        <w:tc>
-          <w:tcPr>
-            <w:tcW w:w="900" w:type="dxa"/>
-            <w:tcBorders>
-              <w:top w:val="single" w:color="A6A6A6" w:sz="4" w:space="0"/>
-              <w:left w:val="single" w:color="A6A6A6" w:sz="4" w:space="0"/>
-              <w:bottom w:val="single" w:color="A6A6A6" w:sz="4" w:space="0"/>
-              <w:right w:val="single" w:color="A6A6A6" w:sz="4" w:space="0"/>
-            </w:tcBorders>
-            <w:tcMar>
-              <w:top w:w="60" w:type="dxa"/>
-              <w:left w:w="100" w:type="dxa"/>
-              <w:bottom w:w="60" w:type="dxa"/>
-              <w:right w:w="100" w:type="dxa"/>
-            </w:tcMar>
-          </w:tcPr>
-          <w:p/>
-        </w:tc>
-      </w:tr>
-      <w:tr>
-        <w:tblPrEx>
-          <w:tblCellMar>
-            <w:top w:w="0" w:type="dxa"/>
-            <w:bottom w:w="0" w:type="dxa"/>
-          </w:tblCellMar>
-        </w:tblPrEx>
-        <w:trPr>
-          <w:trHeight w:val="380"/>
-        </w:trPr>
-        <w:tc>
-          <w:tcPr>
-            <w:tcW w:w="500" w:type="dxa"/>
-            <w:tcBorders>
-              <w:top w:val="single" w:color="A6A6A6" w:sz="4" w:space="0"/>
-              <w:left w:val="single" w:color="A6A6A6" w:sz="4" w:space="0"/>
-              <w:bottom w:val="single" w:color="A6A6A6" w:sz="4" w:space="0"/>
-              <w:right w:val="single" w:color="A6A6A6" w:sz="4" w:space="0"/>
-            </w:tcBorders>
-            <w:tcMar>
-              <w:top w:w="60" w:type="dxa"/>
-              <w:left w:w="100" w:type="dxa"/>
-              <w:bottom w:w="60" w:type="dxa"/>
-              <w:right w:w="100" w:type="dxa"/>
-            </w:tcMar>
-          </w:tcPr>
-          <w:p>
-            <w:r>
-              <w:rPr>
-                <w:sz w:val="20"/>
-                <w:szCs w:val="20"/>
-              </w:rPr>
-              <w:t xml:space="preserve">17</w:t>
-            </w:r>
-          </w:p>
-        </w:tc>
-        <w:tc>
-          <w:tcPr>
-            <w:tcW w:w="5420" w:type="dxa"/>
-            <w:tcBorders>
-              <w:top w:val="single" w:color="A6A6A6" w:sz="4" w:space="0"/>
-              <w:left w:val="single" w:color="A6A6A6" w:sz="4" w:space="0"/>
-              <w:bottom w:val="single" w:color="A6A6A6" w:sz="4" w:space="0"/>
-              <w:right w:val="single" w:color="A6A6A6" w:sz="4" w:space="0"/>
-            </w:tcBorders>
-            <w:tcMar>
-              <w:top w:w="60" w:type="dxa"/>
-              <w:left w:w="100" w:type="dxa"/>
-              <w:bottom w:w="60" w:type="dxa"/>
-              <w:right w:w="100" w:type="dxa"/>
-            </w:tcMar>
-          </w:tcPr>
-          <w:p>
-            <w:r>
-              <w:rPr>
-                <w:b/>
-                <w:bCs/>
-                <w:sz w:val="20"/>
-                <w:szCs w:val="20"/>
-              </w:rPr>
-              <w:t xml:space="preserve">Disclosure to the other investors.</w:t>
-            </w:r>
-            <w:r>
-              <w:rPr>
-                <w:sz w:val="20"/>
-                <w:szCs w:val="20"/>
-              </w:rPr>
-              <w:t xml:space="preserve"> Bramblewood, the angels and the 2025 SAFE holders are being sold SAFEs that rank equally with a 2x preference they don't know about. §18(b) bars the Company from disclosing the side letter, which creates anti-fraud (Rule 10b-5) risk on the concurrent sales. The §14(b) cap-table rep also requires disclosure of Bramblewood's side letter and any promised options.</w:t>
-            </w:r>
-          </w:p>
-        </w:tc>
-        <w:tc>
-          <w:tcPr>
-            <w:tcW w:w="2900" w:type="dxa"/>
-            <w:tcBorders>
-              <w:top w:val="single" w:color="A6A6A6" w:sz="4" w:space="0"/>
-              <w:left w:val="single" w:color="A6A6A6" w:sz="4" w:space="0"/>
-              <w:bottom w:val="single" w:color="A6A6A6" w:sz="4" w:space="0"/>
-              <w:right w:val="single" w:color="A6A6A6" w:sz="4" w:space="0"/>
-            </w:tcBorders>
-            <w:tcMar>
-              <w:top w:w="60" w:type="dxa"/>
-              <w:left w:w="100" w:type="dxa"/>
-              <w:bottom w:w="60" w:type="dxa"/>
-              <w:right w:w="100" w:type="dxa"/>
-            </w:tcMar>
-          </w:tcPr>
-          <w:p>
-            <w:r>
-              <w:rPr>
-                <w:sz w:val="20"/>
-                <w:szCs w:val="20"/>
-              </w:rPr>
-              <w:t xml:space="preserve">Side letter §18(b), §14(b); SAFE §1(d)</w:t>
-            </w:r>
-          </w:p>
-        </w:tc>
-        <w:tc>
-          <w:tcPr>
-            <w:tcW w:w="900" w:type="dxa"/>
-            <w:tcBorders>
-              <w:top w:val="single" w:color="A6A6A6" w:sz="4" w:space="0"/>
-              <w:left w:val="single" w:color="A6A6A6" w:sz="4" w:space="0"/>
-              <w:bottom w:val="single" w:color="A6A6A6" w:sz="4" w:space="0"/>
-              <w:right w:val="single" w:color="A6A6A6" w:sz="4" w:space="0"/>
-            </w:tcBorders>
-            <w:tcMar>
-              <w:top w:w="60" w:type="dxa"/>
-              <w:left w:w="100" w:type="dxa"/>
-              <w:bottom w:w="60" w:type="dxa"/>
-              <w:right w:w="100" w:type="dxa"/>
-            </w:tcMar>
-          </w:tcPr>
-          <w:p/>
-        </w:tc>
-      </w:tr>
-      <w:tr>
-        <w:tblPrEx>
-          <w:tblCellMar>
-            <w:top w:w="0" w:type="dxa"/>
-            <w:bottom w:w="0" w:type="dxa"/>
-          </w:tblCellMar>
-        </w:tblPrEx>
-        <w:trPr>
-          <w:trHeight w:val="380"/>
-        </w:trPr>
-        <w:tc>
-          <w:tcPr>
-            <w:tcW w:w="500" w:type="dxa"/>
-            <w:tcBorders>
-              <w:top w:val="single" w:color="A6A6A6" w:sz="4" w:space="0"/>
-              <w:left w:val="single" w:color="A6A6A6" w:sz="4" w:space="0"/>
-              <w:bottom w:val="single" w:color="A6A6A6" w:sz="4" w:space="0"/>
-              <w:right w:val="single" w:color="A6A6A6" w:sz="4" w:space="0"/>
-            </w:tcBorders>
-            <w:tcMar>
-              <w:top w:w="60" w:type="dxa"/>
-              <w:left w:w="100" w:type="dxa"/>
-              <w:bottom w:w="60" w:type="dxa"/>
-              <w:right w:w="100" w:type="dxa"/>
-            </w:tcMar>
-          </w:tcPr>
-          <w:p>
-            <w:r>
-              <w:rPr>
-                <w:sz w:val="20"/>
-                <w:szCs w:val="20"/>
-              </w:rPr>
-              <w:t xml:space="preserve">18</w:t>
-            </w:r>
-          </w:p>
-        </w:tc>
-        <w:tc>
-          <w:tcPr>
-            <w:tcW w:w="5420" w:type="dxa"/>
-            <w:tcBorders>
-              <w:top w:val="single" w:color="A6A6A6" w:sz="4" w:space="0"/>
-              <w:left w:val="single" w:color="A6A6A6" w:sz="4" w:space="0"/>
-              <w:bottom w:val="single" w:color="A6A6A6" w:sz="4" w:space="0"/>
-              <w:right w:val="single" w:color="A6A6A6" w:sz="4" w:space="0"/>
-            </w:tcBorders>
-            <w:tcMar>
-              <w:top w:w="60" w:type="dxa"/>
-              <w:left w:w="100" w:type="dxa"/>
-              <w:bottom w:w="60" w:type="dxa"/>
-              <w:right w:w="100" w:type="dxa"/>
-            </w:tcMar>
-          </w:tcPr>
-          <w:p>
-            <w:r>
-              <w:rPr>
-                <w:b/>
-                <w:bCs/>
-                <w:sz w:val="20"/>
-                <w:szCs w:val="20"/>
-              </w:rPr>
-              <w:t xml:space="preserve">Company reps and approvals.</w:t>
-            </w:r>
-            <w:r>
-              <w:rPr>
-                <w:sz w:val="20"/>
-                <w:szCs w:val="20"/>
-              </w:rPr>
-              <w:t xml:space="preserve"> The §11 permits rep is unqualified, covers "prospects," and is also an ongoing covenant. That matters for an AI agent that records calls and quotes jobs (call-recording consent and TCPA rules). §14(a) states that all board and stockholder action has been taken, so we need board consents before Monday.</w:t>
-            </w:r>
-          </w:p>
-        </w:tc>
-        <w:tc>
-          <w:tcPr>
-            <w:tcW w:w="2900" w:type="dxa"/>
-            <w:tcBorders>
-              <w:top w:val="single" w:color="A6A6A6" w:sz="4" w:space="0"/>
-              <w:left w:val="single" w:color="A6A6A6" w:sz="4" w:space="0"/>
-              <w:bottom w:val="single" w:color="A6A6A6" w:sz="4" w:space="0"/>
-              <w:right w:val="single" w:color="A6A6A6" w:sz="4" w:space="0"/>
-            </w:tcBorders>
-            <w:tcMar>
-              <w:top w:w="60" w:type="dxa"/>
-              <w:left w:w="100" w:type="dxa"/>
-              <w:bottom w:w="60" w:type="dxa"/>
-              <w:right w:w="100" w:type="dxa"/>
-            </w:tcMar>
-          </w:tcPr>
-          <w:p>
-            <w:r>
-              <w:rPr>
-                <w:sz w:val="20"/>
-                <w:szCs w:val="20"/>
-              </w:rPr>
-              <w:t xml:space="preserve">Side letter §11, §14(a)</w:t>
-            </w:r>
-          </w:p>
-        </w:tc>
-        <w:tc>
-          <w:tcPr>
-            <w:tcW w:w="900" w:type="dxa"/>
-            <w:tcBorders>
-              <w:top w:val="single" w:color="A6A6A6" w:sz="4" w:space="0"/>
-              <w:left w:val="single" w:color="A6A6A6" w:sz="4" w:space="0"/>
-              <w:bottom w:val="single" w:color="A6A6A6" w:sz="4" w:space="0"/>
-              <w:right w:val="single" w:color="A6A6A6" w:sz="4" w:space="0"/>
-            </w:tcBorders>
-            <w:tcMar>
-              <w:top w:w="60" w:type="dxa"/>
-              <w:left w:w="100" w:type="dxa"/>
-              <w:bottom w:w="60" w:type="dxa"/>
-              <w:right w:w="100" w:type="dxa"/>
-            </w:tcMar>
-          </w:tcPr>
-          <w:p/>
-        </w:tc>
-      </w:tr>
-      <w:tr>
-        <w:tblPrEx>
-          <w:tblCellMar>
-            <w:top w:w="0" w:type="dxa"/>
-            <w:bottom w:w="0" w:type="dxa"/>
-          </w:tblCellMar>
-        </w:tblPrEx>
-        <w:trPr>
-          <w:trHeight w:val="380"/>
-        </w:trPr>
-        <w:tc>
-          <w:tcPr>
-            <w:tcW w:w="500" w:type="dxa"/>
-            <w:tcBorders>
-              <w:top w:val="single" w:color="A6A6A6" w:sz="4" w:space="0"/>
-              <w:left w:val="single" w:color="A6A6A6" w:sz="4" w:space="0"/>
-              <w:bottom w:val="single" w:color="A6A6A6" w:sz="4" w:space="0"/>
-              <w:right w:val="single" w:color="A6A6A6" w:sz="4" w:space="0"/>
-            </w:tcBorders>
-            <w:tcMar>
-              <w:top w:w="60" w:type="dxa"/>
-              <w:left w:w="100" w:type="dxa"/>
-              <w:bottom w:w="60" w:type="dxa"/>
-              <w:right w:w="100" w:type="dxa"/>
-            </w:tcMar>
-          </w:tcPr>
-          <w:p>
-            <w:r>
-              <w:rPr>
-                <w:sz w:val="20"/>
-                <w:szCs w:val="20"/>
-              </w:rPr>
-              <w:t xml:space="preserve">19</w:t>
-            </w:r>
-          </w:p>
-        </w:tc>
-        <w:tc>
-          <w:tcPr>
-            <w:tcW w:w="5420" w:type="dxa"/>
-            <w:tcBorders>
-              <w:top w:val="single" w:color="A6A6A6" w:sz="4" w:space="0"/>
-              <w:left w:val="single" w:color="A6A6A6" w:sz="4" w:space="0"/>
-              <w:bottom w:val="single" w:color="A6A6A6" w:sz="4" w:space="0"/>
-              <w:right w:val="single" w:color="A6A6A6" w:sz="4" w:space="0"/>
-            </w:tcBorders>
-            <w:tcMar>
-              <w:top w:w="60" w:type="dxa"/>
-              <w:left w:w="100" w:type="dxa"/>
-              <w:bottom w:w="60" w:type="dxa"/>
-              <w:right w:w="100" w:type="dxa"/>
-            </w:tcMar>
-          </w:tcPr>
-          <w:p>
-            <w:r>
-              <w:rPr>
-                <w:b/>
-                <w:bCs/>
-                <w:sz w:val="20"/>
-                <w:szCs w:val="20"/>
-              </w:rPr>
-              <w:t xml:space="preserve">"Customary" anti-dilution is undefined.</w:t>
-            </w:r>
-            <w:r>
-              <w:rPr>
-                <w:sz w:val="20"/>
-                <w:szCs w:val="20"/>
-              </w:rPr>
-              <w:t xml:space="preserve"> Specify broad-based weighted average and confirm it applies only through the Series A documents.</w:t>
-            </w:r>
-          </w:p>
-        </w:tc>
-        <w:tc>
-          <w:tcPr>
-            <w:tcW w:w="2900" w:type="dxa"/>
-            <w:tcBorders>
-              <w:top w:val="single" w:color="A6A6A6" w:sz="4" w:space="0"/>
-              <w:left w:val="single" w:color="A6A6A6" w:sz="4" w:space="0"/>
-              <w:bottom w:val="single" w:color="A6A6A6" w:sz="4" w:space="0"/>
-              <w:right w:val="single" w:color="A6A6A6" w:sz="4" w:space="0"/>
-            </w:tcBorders>
-            <w:tcMar>
-              <w:top w:w="60" w:type="dxa"/>
-              <w:left w:w="100" w:type="dxa"/>
-              <w:bottom w:w="60" w:type="dxa"/>
-              <w:right w:w="100" w:type="dxa"/>
-            </w:tcMar>
-          </w:tcPr>
-          <w:p>
-            <w:r>
-              <w:rPr>
-                <w:sz w:val="20"/>
-                <w:szCs w:val="20"/>
-              </w:rPr>
-              <w:t xml:space="preserve">Side letter §7(a)</w:t>
-            </w:r>
-          </w:p>
-        </w:tc>
-        <w:tc>
-          <w:tcPr>
-            <w:tcW w:w="900" w:type="dxa"/>
-            <w:tcBorders>
-              <w:top w:val="single" w:color="A6A6A6" w:sz="4" w:space="0"/>
-              <w:left w:val="single" w:color="A6A6A6" w:sz="4" w:space="0"/>
-              <w:bottom w:val="single" w:color="A6A6A6" w:sz="4" w:space="0"/>
-              <w:right w:val="single" w:color="A6A6A6" w:sz="4" w:space="0"/>
-            </w:tcBorders>
-            <w:tcMar>
-              <w:top w:w="60" w:type="dxa"/>
-              <w:left w:w="100" w:type="dxa"/>
-              <w:bottom w:w="60" w:type="dxa"/>
-              <w:right w:w="100" w:type="dxa"/>
-            </w:tcMar>
-          </w:tcPr>
-          <w:p/>
-        </w:tc>
-      </w:tr>
-      <w:tr>
-        <w:tblPrEx>
-          <w:tblCellMar>
-            <w:top w:w="0" w:type="dxa"/>
-            <w:bottom w:w="0" w:type="dxa"/>
-          </w:tblCellMar>
-        </w:tblPrEx>
-        <w:trPr>
-          <w:trHeight w:val="380"/>
-        </w:trPr>
-        <w:tc>
-          <w:tcPr>
-            <w:tcW w:w="500" w:type="dxa"/>
-            <w:tcBorders>
-              <w:top w:val="single" w:color="A6A6A6" w:sz="4" w:space="0"/>
-              <w:left w:val="single" w:color="A6A6A6" w:sz="4" w:space="0"/>
-              <w:bottom w:val="single" w:color="A6A6A6" w:sz="4" w:space="0"/>
-              <w:right w:val="single" w:color="A6A6A6" w:sz="4" w:space="0"/>
-            </w:tcBorders>
-            <w:tcMar>
-              <w:top w:w="60" w:type="dxa"/>
-              <w:left w:w="100" w:type="dxa"/>
-              <w:bottom w:w="60" w:type="dxa"/>
-              <w:right w:w="100" w:type="dxa"/>
-            </w:tcMar>
-          </w:tcPr>
-          <w:p>
-            <w:r>
-              <w:rPr>
-                <w:sz w:val="20"/>
-                <w:szCs w:val="20"/>
-              </w:rPr>
-              <w:t xml:space="preserve">20</w:t>
-            </w:r>
-          </w:p>
-        </w:tc>
-        <w:tc>
-          <w:tcPr>
-            <w:tcW w:w="5420" w:type="dxa"/>
-            <w:tcBorders>
-              <w:top w:val="single" w:color="A6A6A6" w:sz="4" w:space="0"/>
-              <w:left w:val="single" w:color="A6A6A6" w:sz="4" w:space="0"/>
-              <w:bottom w:val="single" w:color="A6A6A6" w:sz="4" w:space="0"/>
-              <w:right w:val="single" w:color="A6A6A6" w:sz="4" w:space="0"/>
-            </w:tcBorders>
-            <w:tcMar>
-              <w:top w:w="60" w:type="dxa"/>
-              <w:left w:w="100" w:type="dxa"/>
-              <w:bottom w:w="60" w:type="dxa"/>
-              <w:right w:w="100" w:type="dxa"/>
-            </w:tcMar>
-          </w:tcPr>
-          <w:p>
-            <w:r>
-              <w:rPr>
-                <w:b/>
-                <w:bCs/>
-                <w:sz w:val="20"/>
-                <w:szCs w:val="20"/>
-              </w:rPr>
-              <w:t xml:space="preserve">Costs and publicity.</w:t>
-            </w:r>
-            <w:r>
-              <w:rPr>
-                <w:sz w:val="20"/>
-                <w:szCs w:val="20"/>
-              </w:rPr>
-              <w:t xml:space="preserve"> Tinsmith pays up to $10K, plus $5K at conversion, for Northvane's counsel, who drafted these papers. Northvane can announce at its LP meeting, but the Company cannot mention Northvane without written approval. Make the publicity terms mutual.</w:t>
-            </w:r>
-          </w:p>
-        </w:tc>
-        <w:tc>
-          <w:tcPr>
-            <w:tcW w:w="2900" w:type="dxa"/>
-            <w:tcBorders>
-              <w:top w:val="single" w:color="A6A6A6" w:sz="4" w:space="0"/>
-              <w:left w:val="single" w:color="A6A6A6" w:sz="4" w:space="0"/>
-              <w:bottom w:val="single" w:color="A6A6A6" w:sz="4" w:space="0"/>
-              <w:right w:val="single" w:color="A6A6A6" w:sz="4" w:space="0"/>
-            </w:tcBorders>
-            <w:tcMar>
-              <w:top w:w="60" w:type="dxa"/>
-              <w:left w:w="100" w:type="dxa"/>
-              <w:bottom w:w="60" w:type="dxa"/>
-              <w:right w:w="100" w:type="dxa"/>
-            </w:tcMar>
-          </w:tcPr>
-          <w:p>
-            <w:r>
-              <w:rPr>
-                <w:sz w:val="20"/>
-                <w:szCs w:val="20"/>
-              </w:rPr>
-              <w:t xml:space="preserve">Side letter §17, §18(b)</w:t>
-            </w:r>
-          </w:p>
-        </w:tc>
-        <w:tc>
-          <w:tcPr>
-            <w:tcW w:w="900" w:type="dxa"/>
-            <w:tcBorders>
-              <w:top w:val="single" w:color="A6A6A6" w:sz="4" w:space="0"/>
-              <w:left w:val="single" w:color="A6A6A6" w:sz="4" w:space="0"/>
-              <w:bottom w:val="single" w:color="A6A6A6" w:sz="4" w:space="0"/>
-              <w:right w:val="single" w:color="A6A6A6" w:sz="4" w:space="0"/>
-            </w:tcBorders>
-            <w:tcMar>
-              <w:top w:w="60" w:type="dxa"/>
-              <w:left w:w="100" w:type="dxa"/>
-              <w:bottom w:w="60" w:type="dxa"/>
-              <w:right w:w="100" w:type="dxa"/>
-            </w:tcMar>
-          </w:tcPr>
-          <w:p/>
-        </w:tc>
-      </w:tr>
-      <w:tr>
-        <w:tblPrEx>
-          <w:tblCellMar>
-            <w:top w:w="0" w:type="dxa"/>
-            <w:bottom w:w="0" w:type="dxa"/>
-          </w:tblCellMar>
-        </w:tblPrEx>
-        <w:trPr>
-          <w:trHeight w:val="380"/>
-        </w:trPr>
-        <w:tc>
-          <w:tcPr>
-            <w:tcW w:w="500" w:type="dxa"/>
-            <w:tcBorders>
-              <w:top w:val="single" w:color="A6A6A6" w:sz="4" w:space="0"/>
-              <w:left w:val="single" w:color="A6A6A6" w:sz="4" w:space="0"/>
-              <w:bottom w:val="single" w:color="A6A6A6" w:sz="4" w:space="0"/>
-              <w:right w:val="single" w:color="A6A6A6" w:sz="4" w:space="0"/>
-            </w:tcBorders>
-            <w:tcMar>
-              <w:top w:w="60" w:type="dxa"/>
-              <w:left w:w="100" w:type="dxa"/>
-              <w:bottom w:w="60" w:type="dxa"/>
-              <w:right w:w="100" w:type="dxa"/>
-            </w:tcMar>
-          </w:tcPr>
-          <w:p>
-            <w:r>
-              <w:rPr>
-                <w:sz w:val="20"/>
-                <w:szCs w:val="20"/>
-              </w:rPr>
-              <w:t xml:space="preserve">21</w:t>
-            </w:r>
-          </w:p>
-        </w:tc>
-        <w:tc>
-          <w:tcPr>
-            <w:tcW w:w="5420" w:type="dxa"/>
-            <w:tcBorders>
-              <w:top w:val="single" w:color="A6A6A6" w:sz="4" w:space="0"/>
-              <w:left w:val="single" w:color="A6A6A6" w:sz="4" w:space="0"/>
-              <w:bottom w:val="single" w:color="A6A6A6" w:sz="4" w:space="0"/>
-              <w:right w:val="single" w:color="A6A6A6" w:sz="4" w:space="0"/>
-            </w:tcBorders>
-            <w:tcMar>
-              <w:top w:w="60" w:type="dxa"/>
-              <w:left w:w="100" w:type="dxa"/>
-              <w:bottom w:w="60" w:type="dxa"/>
-              <w:right w:w="100" w:type="dxa"/>
-            </w:tcMar>
-          </w:tcPr>
-          <w:p>
-            <w:r>
-              <w:rPr>
-                <w:b/>
-                <w:bCs/>
-                <w:sz w:val="20"/>
-                <w:szCs w:val="20"/>
-              </w:rPr>
-              <w:t xml:space="preserve">Put Option at $1: looks alarming, but it is harmless.</w:t>
-            </w:r>
-            <w:r>
-              <w:rPr>
-                <w:sz w:val="20"/>
-                <w:szCs w:val="20"/>
-              </w:rPr>
-              <w:t xml:space="preserve"> Northvane can hand its SAFE or shares back to the Company for $1 total. That costs the Company nothing and returns the equity to the cap table (see Give).</w:t>
-            </w:r>
-          </w:p>
-        </w:tc>
-        <w:tc>
-          <w:tcPr>
-            <w:tcW w:w="2900" w:type="dxa"/>
-            <w:tcBorders>
-              <w:top w:val="single" w:color="A6A6A6" w:sz="4" w:space="0"/>
-              <w:left w:val="single" w:color="A6A6A6" w:sz="4" w:space="0"/>
-              <w:bottom w:val="single" w:color="A6A6A6" w:sz="4" w:space="0"/>
-              <w:right w:val="single" w:color="A6A6A6" w:sz="4" w:space="0"/>
-            </w:tcBorders>
-            <w:tcMar>
-              <w:top w:w="60" w:type="dxa"/>
-              <w:left w:w="100" w:type="dxa"/>
-              <w:bottom w:w="60" w:type="dxa"/>
-              <w:right w:w="100" w:type="dxa"/>
-            </w:tcMar>
-          </w:tcPr>
-          <w:p>
-            <w:r>
-              <w:rPr>
-                <w:sz w:val="20"/>
-                <w:szCs w:val="20"/>
-              </w:rPr>
-              <w:t xml:space="preserve">Side letter §12</w:t>
-            </w:r>
-          </w:p>
-        </w:tc>
-        <w:tc>
-          <w:tcPr>
-            <w:tcW w:w="900" w:type="dxa"/>
-            <w:tcBorders>
-              <w:top w:val="single" w:color="A6A6A6" w:sz="4" w:space="0"/>
-              <w:left w:val="single" w:color="A6A6A6" w:sz="4" w:space="0"/>
-              <w:bottom w:val="single" w:color="A6A6A6" w:sz="4" w:space="0"/>
-              <w:right w:val="single" w:color="A6A6A6" w:sz="4" w:space="0"/>
-            </w:tcBorders>
-            <w:tcMar>
-              <w:top w:w="60" w:type="dxa"/>
-              <w:left w:w="100" w:type="dxa"/>
-              <w:bottom w:w="60" w:type="dxa"/>
-              <w:right w:w="100" w:type="dxa"/>
-            </w:tcMar>
-          </w:tcPr>
-          <w:p/>
-        </w:tc>
-      </w:tr>
-      <w:tr>
-        <w:tblPrEx>
-          <w:tblCellMar>
-            <w:top w:w="0" w:type="dxa"/>
-            <w:bottom w:w="0" w:type="dxa"/>
-          </w:tblCellMar>
-        </w:tblPrEx>
-        <w:trPr>
-          <w:trHeight w:val="380"/>
-        </w:trPr>
-        <w:tc>
-          <w:tcPr>
-            <w:tcW w:w="500" w:type="dxa"/>
-            <w:tcBorders>
-              <w:top w:val="single" w:color="A6A6A6" w:sz="4" w:space="0"/>
-              <w:left w:val="single" w:color="A6A6A6" w:sz="4" w:space="0"/>
-              <w:bottom w:val="single" w:color="A6A6A6" w:sz="4" w:space="0"/>
-              <w:right w:val="single" w:color="A6A6A6" w:sz="4" w:space="0"/>
-            </w:tcBorders>
-            <w:tcMar>
-              <w:top w:w="60" w:type="dxa"/>
-              <w:left w:w="100" w:type="dxa"/>
-              <w:bottom w:w="60" w:type="dxa"/>
-              <w:right w:w="100" w:type="dxa"/>
-            </w:tcMar>
-          </w:tcPr>
-          <w:p>
-            <w:r>
-              <w:rPr>
-                <w:sz w:val="20"/>
-                <w:szCs w:val="20"/>
-              </w:rPr>
-              <w:t xml:space="preserve">22</w:t>
-            </w:r>
-          </w:p>
-        </w:tc>
-        <w:tc>
-          <w:tcPr>
-            <w:tcW w:w="5420" w:type="dxa"/>
-            <w:tcBorders>
-              <w:top w:val="single" w:color="A6A6A6" w:sz="4" w:space="0"/>
-              <w:left w:val="single" w:color="A6A6A6" w:sz="4" w:space="0"/>
-              <w:bottom w:val="single" w:color="A6A6A6" w:sz="4" w:space="0"/>
-              <w:right w:val="single" w:color="A6A6A6" w:sz="4" w:space="0"/>
-            </w:tcBorders>
-            <w:tcMar>
-              <w:top w:w="60" w:type="dxa"/>
-              <w:left w:w="100" w:type="dxa"/>
-              <w:bottom w:w="60" w:type="dxa"/>
-              <w:right w:w="100" w:type="dxa"/>
-            </w:tcMar>
-          </w:tcPr>
-          <w:p>
-            <w:r>
-              <w:rPr>
-                <w:b/>
-                <w:bCs/>
-                <w:sz w:val="20"/>
-                <w:szCs w:val="20"/>
-              </w:rPr>
-              <w:t xml:space="preserve">Timing and leverage.</w:t>
-            </w:r>
-            <w:r>
-              <w:rPr>
-                <w:sz w:val="20"/>
-                <w:szCs w:val="20"/>
-              </w:rPr>
-              <w:t xml:space="preserve"> Monday works for Dana's LP meeting, not for Tinsmith. A short markup cycle won't sink the deal with four months of runway. Bramblewood offered the same $25M cap on clean YC paper, so Dana matched that offer to lead, which gives us room to push.</w:t>
-            </w:r>
-          </w:p>
-        </w:tc>
-        <w:tc>
-          <w:tcPr>
-            <w:tcW w:w="2900" w:type="dxa"/>
-            <w:tcBorders>
-              <w:top w:val="single" w:color="A6A6A6" w:sz="4" w:space="0"/>
-              <w:left w:val="single" w:color="A6A6A6" w:sz="4" w:space="0"/>
-              <w:bottom w:val="single" w:color="A6A6A6" w:sz="4" w:space="0"/>
-              <w:right w:val="single" w:color="A6A6A6" w:sz="4" w:space="0"/>
-            </w:tcBorders>
-            <w:tcMar>
-              <w:top w:w="60" w:type="dxa"/>
-              <w:left w:w="100" w:type="dxa"/>
-              <w:bottom w:w="60" w:type="dxa"/>
-              <w:right w:w="100" w:type="dxa"/>
-            </w:tcMar>
-          </w:tcPr>
-          <w:p>
-            <w:r>
-              <w:rPr>
-                <w:sz w:val="20"/>
-                <w:szCs w:val="20"/>
-              </w:rPr>
-              <w:t xml:space="preserve">Email 1 and Email 2; Background</w:t>
+              <w:t xml:space="preserve">Both emails; Background</w:t>
             </w:r>
           </w:p>
         </w:tc>
@@ -3121,14 +2425,14 @@
                 <w:sz w:val="20"/>
                 <w:szCs w:val="20"/>
               </w:rPr>
-              <w:t xml:space="preserve">Make the SAFE the actual YC SAFE:</w:t>
-            </w:r>
-            <w:r>
-              <w:rPr>
-                <w:sz w:val="20"/>
-                <w:szCs w:val="20"/>
-              </w:rPr>
-              <w:t xml:space="preserve"> 2x Cash-Out (§1(b)-(c)), Standard Preferred instead of Safe Preferred on conversion (§1(a)(2)) and the $5M Equity Financing floor (§2). Northvane SAFE.</w:t>
+              <w:t xml:space="preserve">Fix the SAFE back to the real YC form.</w:t>
+            </w:r>
+            <w:r>
+              <w:rPr>
+                <w:sz w:val="20"/>
+                <w:szCs w:val="20"/>
+              </w:rPr>
+              <w:t xml:space="preserve"> SAFE §1(a)(2), §1(b)-(c), §2</w:t>
             </w:r>
           </w:p>
         </w:tc>
@@ -3154,29 +2458,20 @@
             </w:pPr>
             <w:r>
               <w:rPr>
+                <w:sz w:val="20"/>
+                <w:szCs w:val="20"/>
+              </w:rPr>
+              <w:t xml:space="preserve">Northvane gets 2x its money first, a bigger preference in the Series A, and a SAFE that skips small rounds.</w:t>
+            </w:r>
+          </w:p>
+          <w:p>
+            <w:r>
+              <w:rPr>
                 <w:b/>
                 <w:bCs/>
                 <w:sz w:val="20"/>
                 <w:szCs w:val="20"/>
               </w:rPr>
-              <w:t xml:space="preserve">Does:</w:t>
-            </w:r>
-            <w:r>
-              <w:rPr>
-                <w:sz w:val="20"/>
-                <w:szCs w:val="20"/>
-              </w:rPr>
-              <w:t xml:space="preserve"> Doubles Northvane's payout to $3M in any sale or wind-down, inflates its preference at the Series A, and lets its SAFE stay outstanding through any priced round under $5M.</w:t>
-            </w:r>
-          </w:p>
-          <w:p>
-            <w:r>
-              <w:rPr>
-                <w:b/>
-                <w:bCs/>
-                <w:sz w:val="20"/>
-                <w:szCs w:val="20"/>
-              </w:rPr>
               <w:t xml:space="preserve">For Alex:</w:t>
             </w:r>
             <w:r>
@@ -3184,7 +2479,7 @@
                 <w:sz w:val="20"/>
                 <w:szCs w:val="20"/>
               </w:rPr>
-              <w:t xml:space="preserve"> "In any sale below about $50M, Northvane gets twice its money back before you and Priya see a dollar." In a $10M sale, common gets ~$5.6M instead of ~$7.1M, about $800K less for Alex and $600K less for Priya. If the Series A is at ~$50M post-money, Northvane's $1.5M carries a ~$3M preference ahead of everyone. A $3-4M seed would convert everyone except Northvane, leaving it with its 2x, MFN and vetoes.</w:t>
+              <w:t xml:space="preserve"> "In any sale under ~$50M, Northvane takes $3M before you see a dollar." In a $10M sale, Alex loses ~$800K and Priya ~$600K.</w:t>
             </w:r>
           </w:p>
         </w:tc>
@@ -3205,24 +2500,12 @@
             </w:tcMar>
           </w:tcPr>
           <w:p>
-            <w:pPr>
-              <w:spacing w:after="80"/>
-            </w:pPr>
-            <w:r>
-              <w:rPr>
-                <w:sz w:val="20"/>
-                <w:szCs w:val="20"/>
-              </w:rPr>
-              <w:t xml:space="preserve">Use the unmodified YC post-money valuation-cap SAFE: 1x Cash-Out, Safe Preferred Stock, no minimum. That is what Dana's email and the SAFE itself say it already is, and it matches Bramblewood's and the angels' paper.</w:t>
-            </w:r>
-          </w:p>
-          <w:p>
-            <w:r>
-              <w:rPr>
-                <w:sz w:val="20"/>
-                <w:szCs w:val="20"/>
-              </w:rPr>
-              <w:t xml:space="preserve">Present it as fixing the document to match the deal Dana described, not as a renegotiation.</w:t>
+            <w:r>
+              <w:rPr>
+                <w:sz w:val="20"/>
+                <w:szCs w:val="20"/>
+              </w:rPr>
+              <w:t xml:space="preserve">Use the unmodified YC SAFE: 1x, "Safe Preferred," no $5M minimum. Dana already says it's the standard form, so we're only asking her to make that true. It also matches Bramblewood's and the angels' terms.</w:t>
             </w:r>
           </w:p>
         </w:tc>
@@ -3287,14 +2570,14 @@
                 <w:sz w:val="20"/>
                 <w:szCs w:val="20"/>
               </w:rPr>
-              <w:t xml:space="preserve">Founder re-vesting and double trigger:</w:t>
-            </w:r>
-            <w:r>
-              <w:rPr>
-                <w:sz w:val="20"/>
-                <w:szCs w:val="20"/>
-              </w:rPr>
-              <w:t xml:space="preserve"> Side letter §9(b) (signed by Alex and Priya personally).</w:t>
+              <w:t xml:space="preserve">Founder re-vesting.</w:t>
+            </w:r>
+            <w:r>
+              <w:rPr>
+                <w:sz w:val="20"/>
+                <w:szCs w:val="20"/>
+              </w:rPr>
+              <w:t xml:space="preserve"> Side letter §9(b)</w:t>
             </w:r>
           </w:p>
         </w:tc>
@@ -3320,29 +2603,20 @@
             </w:pPr>
             <w:r>
               <w:rPr>
+                <w:sz w:val="20"/>
+                <w:szCs w:val="20"/>
+              </w:rPr>
+              <w:t xml:space="preserve">Resets both founders to 0% vested for 4 more years and weakens their acceleration on a sale.</w:t>
+            </w:r>
+          </w:p>
+          <w:p>
+            <w:r>
+              <w:rPr>
                 <w:b/>
                 <w:bCs/>
                 <w:sz w:val="20"/>
                 <w:szCs w:val="20"/>
               </w:rPr>
-              <w:t xml:space="preserve">Does:</w:t>
-            </w:r>
-            <w:r>
-              <w:rPr>
-                <w:sz w:val="20"/>
-                <w:szCs w:val="20"/>
-              </w:rPr>
-              <w:t xml:space="preserve"> Resets both founders to 0% vested, re-vests monthly over 4 years from Oct. 2026, and replaces single-trigger with double-trigger acceleration.</w:t>
-            </w:r>
-          </w:p>
-          <w:p>
-            <w:r>
-              <w:rPr>
-                <w:b/>
-                <w:bCs/>
-                <w:sz w:val="20"/>
-                <w:szCs w:val="20"/>
-              </w:rPr>
               <w:t xml:space="preserve">For Alex:</w:t>
             </w:r>
             <w:r>
@@ -3350,7 +2624,7 @@
                 <w:sz w:val="20"/>
                 <w:szCs w:val="20"/>
               </w:rPr>
-              <w:t xml:space="preserve"> About 4.16M vested founder shares (Alex ~2.34M, Priya ~1.82M) go back at risk of repurchase at cost. Full vesting slips from Sept. 2028 to Oct. 2030. If Priya left a year from now she would keep ~875K shares instead of ~2.7M. A sale would no longer vest them unless they are also terminated. A Series A lead may ask for re-vesting again, so they could be re-vested twice. It is a personal decision, so they need their own advice and should consider a protective 83(b).</w:t>
+              <w:t xml:space="preserve"> About 4.16M already-earned shares go back at risk. If Priya left in a year, she'd keep ~875K shares instead of ~2.7M.</w:t>
             </w:r>
           </w:p>
         </w:tc>
@@ -3371,24 +2645,12 @@
             </w:tcMar>
           </w:tcPr>
           <w:p>
-            <w:pPr>
-              <w:spacing w:after="80"/>
-            </w:pPr>
-            <w:r>
-              <w:rPr>
-                <w:sz w:val="20"/>
-                <w:szCs w:val="20"/>
-              </w:rPr>
-              <w:t xml:space="preserve">Strike §9(b). Northvane is investing at a $25M cap in a company whose founders still have ~48% unvested, so the retention incentive already exists.</w:t>
-            </w:r>
-          </w:p>
-          <w:p>
-            <w:r>
-              <w:rPr>
-                <w:sz w:val="20"/>
-                <w:szCs w:val="20"/>
-              </w:rPr>
-              <w:t xml:space="preserve">Fallback: leave vesting to the Series A, or at most add 12 months to the remaining schedule with full credit for time served. Keep single trigger, or use double trigger with partial (e.g., 50%) single-trigger acceleration. No re-vesting of shares already vested.</w:t>
+            <w:r>
+              <w:rPr>
+                <w:sz w:val="20"/>
+                <w:szCs w:val="20"/>
+              </w:rPr>
+              <w:t xml:space="preserve">Delete it. The founders still have ~48% unvested, which already keeps them in place. Fallback: credit time already served, and revisit at the Series A.</w:t>
             </w:r>
           </w:p>
         </w:tc>
@@ -3453,14 +2715,14 @@
                 <w:sz w:val="20"/>
                 <w:szCs w:val="20"/>
               </w:rPr>
-              <w:t xml:space="preserve">Northvane vetoes and a side letter that overrides everything:</w:t>
-            </w:r>
-            <w:r>
-              <w:rPr>
-                <w:sz w:val="20"/>
-                <w:szCs w:val="20"/>
-              </w:rPr>
-              <w:t xml:space="preserve"> Side letter §8 (protective provisions) and §9(d) (equity-plan freeze), plus §20(a)-(b) and §19.</w:t>
+              <w:t xml:space="preserve">Vetoes and the "override everything" clause.</w:t>
+            </w:r>
+            <w:r>
+              <w:rPr>
+                <w:sz w:val="20"/>
+                <w:szCs w:val="20"/>
+              </w:rPr>
+              <w:t xml:space="preserve"> Side letter §8, §9(d), §20(a)-(b)</w:t>
             </w:r>
           </w:p>
         </w:tc>
@@ -3486,29 +2748,20 @@
             </w:pPr>
             <w:r>
               <w:rPr>
+                <w:sz w:val="20"/>
+                <w:szCs w:val="20"/>
+              </w:rPr>
+              <w:t xml:space="preserve">Lets one SAFE investor block a sale, a small round, or a bigger option pool, and beats even the charter.</w:t>
+            </w:r>
+          </w:p>
+          <w:p>
+            <w:r>
+              <w:rPr>
                 <w:b/>
                 <w:bCs/>
                 <w:sz w:val="20"/>
                 <w:szCs w:val="20"/>
               </w:rPr>
-              <w:t xml:space="preserve">Does:</w:t>
-            </w:r>
-            <w:r>
-              <w:rPr>
-                <w:sz w:val="20"/>
-                <w:szCs w:val="20"/>
-              </w:rPr>
-              <w:t xml:space="preserve"> Until a $5M+ round, Northvane can block a sale of the company, any priced round under $5M, any increase in authorized shares or the option pool, and any amendment to another SAFE. The letter also claims to override the charter and the Series A documents and never ends.</w:t>
-            </w:r>
-          </w:p>
-          <w:p>
-            <w:r>
-              <w:rPr>
-                <w:b/>
-                <w:bCs/>
-                <w:sz w:val="20"/>
-                <w:szCs w:val="20"/>
-              </w:rPr>
               <w:t xml:space="preserve">For Alex:</w:t>
             </w:r>
             <w:r>
@@ -3516,7 +2769,7 @@
                 <w:sz w:val="20"/>
                 <w:szCs w:val="20"/>
               </w:rPr>
-              <w:t xml:space="preserve"> "Northvane can block things the board, founders and Bramblewood all want," for example a $20M acquisition offer in 2027, even though Northvane would be paid its $3M. It also means a fight with the Series A lead later.</w:t>
+              <w:t xml:space="preserve"> "Dana could block a $20M acquisition offer that you, Priya and Bramblewood all want."</w:t>
             </w:r>
           </w:p>
         </w:tc>
@@ -3537,24 +2790,12 @@
             </w:tcMar>
           </w:tcPr>
           <w:p>
-            <w:pPr>
-              <w:spacing w:after="80"/>
-            </w:pPr>
-            <w:r>
-              <w:rPr>
-                <w:sz w:val="20"/>
-                <w:szCs w:val="20"/>
-              </w:rPr>
-              <w:t xml:space="preserve">Delete §8, §9(d) and §20(a)-(b). A SAFE holder is not a stockholder, and Bramblewood asked for none of this.</w:t>
-            </w:r>
-          </w:p>
-          <w:p>
-            <w:r>
-              <w:rPr>
-                <w:sz w:val="20"/>
-                <w:szCs w:val="20"/>
-              </w:rPr>
-              <w:t xml:space="preserve">Fallback: require consent only for actions that adversely and disproportionately affect the Northvane SAFE, carving out any Liquidity Event in which the SAFE is paid on its terms. End the side letter at the Equity Financing, with the Series A documents replacing it (as in the YC pro rata letter). Only §5 management rights and confidentiality would survive.</w:t>
+            <w:r>
+              <w:rPr>
+                <w:sz w:val="20"/>
+                <w:szCs w:val="20"/>
+              </w:rPr>
+              <w:t xml:space="preserve">Delete them. Bramblewood didn't ask for any of this. Fallback: consent only for changes that specifically hurt Northvane's SAFE, with the side letter ending at the Series A (like the YC letter).</w:t>
             </w:r>
           </w:p>
         </w:tc>
@@ -3754,7 +2995,7 @@
                 <w:sz w:val="20"/>
                 <w:szCs w:val="20"/>
               </w:rPr>
-              <w:t xml:space="preserve">Put Option:</w:t>
+              <w:t xml:space="preserve">$1 put option.</w:t>
             </w:r>
             <w:r>
               <w:rPr>
@@ -3787,7 +3028,7 @@
                 <w:sz w:val="20"/>
                 <w:szCs w:val="20"/>
               </w:rPr>
-              <w:t xml:space="preserve">It looks alarming, but it only lets Northvane hand its SAFE or shares back to the Company for $1 total. It costs Tinsmith $1, returns that ownership to the cap table, and ends Northvane's side-letter rights (§19(a)). Funds use this to book a tax loss or clean up at fund wind-down, which likely matters to a first-time fund. A $1 repurchase falls within the QSBS de minimis rules for redemptions. Accepting it costs nothing and earns goodwill.</w:t>
+              <w:t xml:space="preserve">It looks scary, but it only lets Northvane hand its stake back to the company for $1. The company loses nothing and gets the shares back. Funds use this to book a tax loss.</w:t>
             </w:r>
           </w:p>
         </w:tc>
@@ -3852,7 +3093,7 @@
                 <w:sz w:val="20"/>
                 <w:szCs w:val="20"/>
               </w:rPr>
-              <w:t xml:space="preserve">QSBS reps and covenant:</w:t>
+              <w:t xml:space="preserve">QSBS tax reps.</w:t>
             </w:r>
             <w:r>
               <w:rPr>
@@ -3885,7 +3126,7 @@
                 <w:sz w:val="20"/>
                 <w:szCs w:val="20"/>
               </w:rPr>
-              <w:t xml:space="preserve">It helps everyone, including the founders, by protecting §1202 treatment. The reps should be true for a 2024 Delaware C-corp selling software with well under $75M in gross assets, as long as there have been no stock repurchases in the last year (confirm). The covenant is only "commercially reasonable efforts," with a board fiduciary out. (§5 management rights, the standard VCOC letter, is an equally good give.)</w:t>
+              <w:t xml:space="preserve">They help the founders too (tax-free gains on a sale). They should be true for Tinsmith, and the promise is only "reasonable efforts."</w:t>
             </w:r>
           </w:p>
         </w:tc>
@@ -3992,24 +3233,12 @@
             </w:tcMar>
           </w:tcPr>
           <w:p>
-            <w:pPr>
-              <w:spacing w:after="80"/>
-            </w:pPr>
-            <w:r>
-              <w:rPr>
-                <w:sz w:val="20"/>
-                <w:szCs w:val="20"/>
-              </w:rPr>
-              <w:t xml:space="preserve">If Dana won't move on the SAFE changes and founder re-vesting, would Bramblewood (which offered the same $25M cap on plain YC paper) lead or increase its check so you can close without Northvane?</w:t>
-            </w:r>
-          </w:p>
-          <w:p>
-            <w:r>
-              <w:rPr>
-                <w:sz w:val="20"/>
-                <w:szCs w:val="20"/>
-              </w:rPr>
-              <w:t xml:space="preserve">Why it matters: Alex's real alternative to Northvane decides how hard we push on the three Fight items, and whether "walk away" is a credible answer if Dana says these are her standard terms.</w:t>
+            <w:r>
+              <w:rPr>
+                <w:sz w:val="20"/>
+                <w:szCs w:val="20"/>
+              </w:rPr>
+              <w:t xml:space="preserve">If Dana won't drop the SAFE changes and the founder re-vesting, would Bramblewood lead or put in more so you can close without Northvane? (Tells us how hard we can push.)</w:t>
             </w:r>
           </w:p>
         </w:tc>

</xml_diff>

<commit_message>
Shorten worksheet answers and set them in Times New Roman
Co-Authored-By: Claude Opus 5.5 <noreply@anthropic.com>
Claude-Session: https://claude.ai/code/session_0131d3R7MWmwtEPeZdc3GrMD
</commit_message>
<xml_diff>
--- a/SAFE Exercise - 4. Group Worksheet (2026) - Completed.docx
+++ b/SAFE Exercise - 4. Group Worksheet (2026) - Completed.docx
@@ -140,8 +140,9 @@
           <w:p>
             <w:r>
               <w:rPr>
-                <w:sz w:val="20"/>
-                <w:szCs w:val="20"/>
+                <w:rFonts w:ascii="Times New Roman" w:hAnsi="Times New Roman" w:cs="Times New Roman" w:eastAsia="Times New Roman"/>
+                <w:sz w:val="24"/>
+                <w:szCs w:val="24"/>
               </w:rPr>
               <w:t xml:space="preserve">[Group member names]</w:t>
             </w:r>
@@ -355,8 +356,9 @@
           <w:p>
             <w:r>
               <w:rPr>
-                <w:sz w:val="20"/>
-                <w:szCs w:val="20"/>
+                <w:rFonts w:ascii="Times New Roman" w:hAnsi="Times New Roman" w:cs="Times New Roman" w:eastAsia="Times New Roman"/>
+                <w:sz w:val="24"/>
+                <w:szCs w:val="24"/>
               </w:rPr>
               <w:t xml:space="preserve">1</w:t>
             </w:r>
@@ -381,19 +383,11 @@
           <w:p>
             <w:r>
               <w:rPr>
-                <w:b/>
-                <w:bCs/>
-                <w:sz w:val="20"/>
-                <w:szCs w:val="20"/>
-              </w:rPr>
-              <w:t xml:space="preserve">The SAFE is NOT the standard YC SAFE.</w:t>
-            </w:r>
-            <w:r>
-              <w:rPr>
-                <w:sz w:val="20"/>
-                <w:szCs w:val="20"/>
-              </w:rPr>
-              <w:t xml:space="preserve"> Compared line by line with the YC cap-only form, it has three changes (rows 2-4). It also says "neither party has modified the form," which is false. Alex can't skip it.</w:t>
+                <w:rFonts w:ascii="Times New Roman" w:hAnsi="Times New Roman" w:cs="Times New Roman" w:eastAsia="Times New Roman"/>
+                <w:sz w:val="24"/>
+                <w:szCs w:val="24"/>
+              </w:rPr>
+              <w:t xml:space="preserve">The SAFE isn't actually the standard YC form, even though it says it is. Compared to the real YC SAFE, Northvane made three changes (rows 2-4).</w:t>
             </w:r>
           </w:p>
         </w:tc>
@@ -416,10 +410,11 @@
           <w:p>
             <w:r>
               <w:rPr>
-                <w:sz w:val="20"/>
-                <w:szCs w:val="20"/>
-              </w:rPr>
-              <w:t xml:space="preserve">SAFE, opening paragraph; Dana's email</w:t>
+                <w:rFonts w:ascii="Times New Roman" w:hAnsi="Times New Roman" w:cs="Times New Roman" w:eastAsia="Times New Roman"/>
+                <w:sz w:val="24"/>
+                <w:szCs w:val="24"/>
+              </w:rPr>
+              <w:t xml:space="preserve">SAFE, opening paragraph</w:t>
             </w:r>
           </w:p>
         </w:tc>
@@ -471,8 +466,9 @@
           <w:p>
             <w:r>
               <w:rPr>
-                <w:sz w:val="20"/>
-                <w:szCs w:val="20"/>
+                <w:rFonts w:ascii="Times New Roman" w:hAnsi="Times New Roman" w:cs="Times New Roman" w:eastAsia="Times New Roman"/>
+                <w:sz w:val="24"/>
+                <w:szCs w:val="24"/>
               </w:rPr>
               <w:t xml:space="preserve">2</w:t>
             </w:r>
@@ -497,19 +493,11 @@
           <w:p>
             <w:r>
               <w:rPr>
-                <w:b/>
-                <w:bCs/>
-                <w:sz w:val="20"/>
-                <w:szCs w:val="20"/>
-              </w:rPr>
-              <w:t xml:space="preserve">2x payout instead of 1x.</w:t>
-            </w:r>
-            <w:r>
-              <w:rPr>
-                <w:sz w:val="20"/>
-                <w:szCs w:val="20"/>
-              </w:rPr>
-              <w:t xml:space="preserve"> In a sale or shutdown, Northvane gets $3M (twice its $1.5M) before the founders get anything. Example: in a $10M sale, Alex gets about $800K less and Priya about $600K less.</w:t>
+                <w:rFonts w:ascii="Times New Roman" w:hAnsi="Times New Roman" w:cs="Times New Roman" w:eastAsia="Times New Roman"/>
+                <w:sz w:val="24"/>
+                <w:szCs w:val="24"/>
+              </w:rPr>
+              <w:t xml:space="preserve">Northvane gets 2x its money back in a sale or shutdown instead of 1x. In a $10M sale, that's $3M off the top before the founders see anything.</w:t>
             </w:r>
           </w:p>
         </w:tc>
@@ -532,10 +520,11 @@
           <w:p>
             <w:r>
               <w:rPr>
-                <w:sz w:val="20"/>
-                <w:szCs w:val="20"/>
-              </w:rPr>
-              <w:t xml:space="preserve">SAFE §1(b), §1(c)</w:t>
+                <w:rFonts w:ascii="Times New Roman" w:hAnsi="Times New Roman" w:cs="Times New Roman" w:eastAsia="Times New Roman"/>
+                <w:sz w:val="24"/>
+                <w:szCs w:val="24"/>
+              </w:rPr>
+              <w:t xml:space="preserve">SAFE §1(b)-(c)</w:t>
             </w:r>
           </w:p>
         </w:tc>
@@ -587,8 +576,9 @@
           <w:p>
             <w:r>
               <w:rPr>
-                <w:sz w:val="20"/>
-                <w:szCs w:val="20"/>
+                <w:rFonts w:ascii="Times New Roman" w:hAnsi="Times New Roman" w:cs="Times New Roman" w:eastAsia="Times New Roman"/>
+                <w:sz w:val="24"/>
+                <w:szCs w:val="24"/>
               </w:rPr>
               <w:t xml:space="preserve">3</w:t>
             </w:r>
@@ -613,19 +603,11 @@
           <w:p>
             <w:r>
               <w:rPr>
-                <w:b/>
-                <w:bCs/>
-                <w:sz w:val="20"/>
-                <w:szCs w:val="20"/>
-              </w:rPr>
-              <w:t xml:space="preserve">Hidden one-word change: "Standard" instead of "Safe" Preferred.</w:t>
-            </w:r>
-            <w:r>
-              <w:rPr>
-                <w:sz w:val="20"/>
-                <w:szCs w:val="20"/>
-              </w:rPr>
-              <w:t xml:space="preserve"> When the SAFE converts in the Series A, Northvane's preferred stock gets a payout preference based on the Series A price instead of its own lower price. If the Series A is at 2x the cap, Northvane's $1.5M carries a ~$3M preference.</w:t>
+                <w:rFonts w:ascii="Times New Roman" w:hAnsi="Times New Roman" w:cs="Times New Roman" w:eastAsia="Times New Roman"/>
+                <w:sz w:val="24"/>
+                <w:szCs w:val="24"/>
+              </w:rPr>
+              <w:t xml:space="preserve">One word was swapped: Northvane converts into "Standard" Preferred instead of "Safe" Preferred. That quietly gives it a bigger preference in the Series A, about $3M on a $1.5M check.</w:t>
             </w:r>
           </w:p>
         </w:tc>
@@ -648,10 +630,11 @@
           <w:p>
             <w:r>
               <w:rPr>
-                <w:sz w:val="20"/>
-                <w:szCs w:val="20"/>
-              </w:rPr>
-              <w:t xml:space="preserve">SAFE §1(a), clause (2)</w:t>
+                <w:rFonts w:ascii="Times New Roman" w:hAnsi="Times New Roman" w:cs="Times New Roman" w:eastAsia="Times New Roman"/>
+                <w:sz w:val="24"/>
+                <w:szCs w:val="24"/>
+              </w:rPr>
+              <w:t xml:space="preserve">SAFE §1(a)(2)</w:t>
             </w:r>
           </w:p>
         </w:tc>
@@ -674,8 +657,9 @@
           <w:p>
             <w:r>
               <w:rPr>
-                <w:sz w:val="20"/>
-                <w:szCs w:val="20"/>
+                <w:rFonts w:ascii="Times New Roman" w:hAnsi="Times New Roman" w:cs="Times New Roman" w:eastAsia="Times New Roman"/>
+                <w:sz w:val="24"/>
+                <w:szCs w:val="24"/>
               </w:rPr>
               <w:t xml:space="preserve">*</w:t>
             </w:r>
@@ -711,8 +695,9 @@
           <w:p>
             <w:r>
               <w:rPr>
-                <w:sz w:val="20"/>
-                <w:szCs w:val="20"/>
+                <w:rFonts w:ascii="Times New Roman" w:hAnsi="Times New Roman" w:cs="Times New Roman" w:eastAsia="Times New Roman"/>
+                <w:sz w:val="24"/>
+                <w:szCs w:val="24"/>
               </w:rPr>
               <w:t xml:space="preserve">4</w:t>
             </w:r>
@@ -737,19 +722,11 @@
           <w:p>
             <w:r>
               <w:rPr>
-                <w:b/>
-                <w:bCs/>
-                <w:sz w:val="20"/>
-                <w:szCs w:val="20"/>
-              </w:rPr>
-              <w:t xml:space="preserve">$5M minimum round.</w:t>
-            </w:r>
-            <w:r>
-              <w:rPr>
-                <w:sz w:val="20"/>
-                <w:szCs w:val="20"/>
-              </w:rPr>
-              <w:t xml:space="preserve"> The YC form converts in any priced round. Here, a round under $5M converts everyone except Northvane, which keeps its 2x payout and vetoes.</w:t>
+                <w:rFonts w:ascii="Times New Roman" w:hAnsi="Times New Roman" w:cs="Times New Roman" w:eastAsia="Times New Roman"/>
+                <w:sz w:val="24"/>
+                <w:szCs w:val="24"/>
+              </w:rPr>
+              <w:t xml:space="preserve">The SAFE only converts in a round of $5M or more. In a smaller round, everyone else converts and Northvane keeps its 2x and its vetoes.</w:t>
             </w:r>
           </w:p>
         </w:tc>
@@ -772,10 +749,11 @@
           <w:p>
             <w:r>
               <w:rPr>
-                <w:sz w:val="20"/>
-                <w:szCs w:val="20"/>
-              </w:rPr>
-              <w:t xml:space="preserve">SAFE §2, "Equity Financing"</w:t>
+                <w:rFonts w:ascii="Times New Roman" w:hAnsi="Times New Roman" w:cs="Times New Roman" w:eastAsia="Times New Roman"/>
+                <w:sz w:val="24"/>
+                <w:szCs w:val="24"/>
+              </w:rPr>
+              <w:t xml:space="preserve">SAFE §2 ("Equity Financing")</w:t>
             </w:r>
           </w:p>
         </w:tc>
@@ -827,8 +805,9 @@
           <w:p>
             <w:r>
               <w:rPr>
-                <w:sz w:val="20"/>
-                <w:szCs w:val="20"/>
+                <w:rFonts w:ascii="Times New Roman" w:hAnsi="Times New Roman" w:cs="Times New Roman" w:eastAsia="Times New Roman"/>
+                <w:sz w:val="24"/>
+                <w:szCs w:val="24"/>
               </w:rPr>
               <w:t xml:space="preserve">5</w:t>
             </w:r>
@@ -853,19 +832,11 @@
           <w:p>
             <w:r>
               <w:rPr>
-                <w:b/>
-                <w:bCs/>
-                <w:sz w:val="20"/>
-                <w:szCs w:val="20"/>
-              </w:rPr>
-              <w:t xml:space="preserve">Founders lose their vesting.</w:t>
-            </w:r>
-            <w:r>
-              <w:rPr>
-                <w:sz w:val="20"/>
-                <w:szCs w:val="20"/>
-              </w:rPr>
-              <w:t xml:space="preserve"> Alex and Priya are about 52% vested. This resets both to 0%, re-vesting over 4 more years (Alex ~2.34M shares, Priya ~1.82M shares put back at risk). Their acceleration on a sale also becomes "double trigger": it only applies if they are also fired. This is Priya's concern.</w:t>
+                <w:rFonts w:ascii="Times New Roman" w:hAnsi="Times New Roman" w:cs="Times New Roman" w:eastAsia="Times New Roman"/>
+                <w:sz w:val="24"/>
+                <w:szCs w:val="24"/>
+              </w:rPr>
+              <w:t xml:space="preserve">The founders' vesting resets to zero and starts over for four years. Alex and Priya are about half vested, so this takes back shares they've already earned.</w:t>
             </w:r>
           </w:p>
         </w:tc>
@@ -888,8 +859,9 @@
           <w:p>
             <w:r>
               <w:rPr>
-                <w:sz w:val="20"/>
-                <w:szCs w:val="20"/>
+                <w:rFonts w:ascii="Times New Roman" w:hAnsi="Times New Roman" w:cs="Times New Roman" w:eastAsia="Times New Roman"/>
+                <w:sz w:val="24"/>
+                <w:szCs w:val="24"/>
               </w:rPr>
               <w:t xml:space="preserve">Side letter §9(b)</w:t>
             </w:r>
@@ -943,8 +915,9 @@
           <w:p>
             <w:r>
               <w:rPr>
-                <w:sz w:val="20"/>
-                <w:szCs w:val="20"/>
+                <w:rFonts w:ascii="Times New Roman" w:hAnsi="Times New Roman" w:cs="Times New Roman" w:eastAsia="Times New Roman"/>
+                <w:sz w:val="24"/>
+                <w:szCs w:val="24"/>
               </w:rPr>
               <w:t xml:space="preserve">6</w:t>
             </w:r>
@@ -969,19 +942,11 @@
           <w:p>
             <w:r>
               <w:rPr>
-                <w:b/>
-                <w:bCs/>
-                <w:sz w:val="20"/>
-                <w:szCs w:val="20"/>
-              </w:rPr>
-              <w:t xml:space="preserve">Founders sign personally.</w:t>
-            </w:r>
-            <w:r>
-              <w:rPr>
-                <w:sz w:val="20"/>
-                <w:szCs w:val="20"/>
-              </w:rPr>
-              <w:t xml:space="preserve"> We represent the company, not Alex and Priya. They should get their own advice on §6(b) and §9(b). Consider a protective 83(b) election.</w:t>
+                <w:rFonts w:ascii="Times New Roman" w:hAnsi="Times New Roman" w:cs="Times New Roman" w:eastAsia="Times New Roman"/>
+                <w:sz w:val="24"/>
+                <w:szCs w:val="24"/>
+              </w:rPr>
+              <w:t xml:space="preserve">Northvane gets vetoes over selling the company, raising a small round, and growing the option pool. That's a lot of control for a SAFE investor who doesn't even own stock yet.</w:t>
             </w:r>
           </w:p>
         </w:tc>
@@ -1004,10 +969,11 @@
           <w:p>
             <w:r>
               <w:rPr>
-                <w:sz w:val="20"/>
-                <w:szCs w:val="20"/>
-              </w:rPr>
-              <w:t xml:space="preserve">Side letter signature page; §6(b), §9(b)</w:t>
+                <w:rFonts w:ascii="Times New Roman" w:hAnsi="Times New Roman" w:cs="Times New Roman" w:eastAsia="Times New Roman"/>
+                <w:sz w:val="24"/>
+                <w:szCs w:val="24"/>
+              </w:rPr>
+              <w:t xml:space="preserve">Side letter §8, §9(d)</w:t>
             </w:r>
           </w:p>
         </w:tc>
@@ -1059,8 +1025,9 @@
           <w:p>
             <w:r>
               <w:rPr>
-                <w:sz w:val="20"/>
-                <w:szCs w:val="20"/>
+                <w:rFonts w:ascii="Times New Roman" w:hAnsi="Times New Roman" w:cs="Times New Roman" w:eastAsia="Times New Roman"/>
+                <w:sz w:val="24"/>
+                <w:szCs w:val="24"/>
               </w:rPr>
               <w:t xml:space="preserve">7</w:t>
             </w:r>
@@ -1085,19 +1052,11 @@
           <w:p>
             <w:r>
               <w:rPr>
-                <w:b/>
-                <w:bCs/>
-                <w:sz w:val="20"/>
-                <w:szCs w:val="20"/>
-              </w:rPr>
-              <w:t xml:space="preserve">Northvane gets vetoes before the Series A.</w:t>
-            </w:r>
-            <w:r>
-              <w:rPr>
-                <w:sz w:val="20"/>
-                <w:szCs w:val="20"/>
-              </w:rPr>
-              <w:t xml:space="preserve"> Without its consent the company can't sell itself, do a small priced round, add authorized shares, or grow the option pool.</w:t>
+                <w:rFonts w:ascii="Times New Roman" w:hAnsi="Times New Roman" w:cs="Times New Roman" w:eastAsia="Times New Roman"/>
+                <w:sz w:val="24"/>
+                <w:szCs w:val="24"/>
+              </w:rPr>
+              <w:t xml:space="preserve">The pro rata and MFN rights cover every future round and never end. The YC pro rata letter only covers the next priced round.</w:t>
             </w:r>
           </w:p>
         </w:tc>
@@ -1120,10 +1079,11 @@
           <w:p>
             <w:r>
               <w:rPr>
-                <w:sz w:val="20"/>
-                <w:szCs w:val="20"/>
-              </w:rPr>
-              <w:t xml:space="preserve">Side letter §8, §9(d)</w:t>
+                <w:rFonts w:ascii="Times New Roman" w:hAnsi="Times New Roman" w:cs="Times New Roman" w:eastAsia="Times New Roman"/>
+                <w:sz w:val="24"/>
+                <w:szCs w:val="24"/>
+              </w:rPr>
+              <w:t xml:space="preserve">Side letter §1, §2</w:t>
             </w:r>
           </w:p>
         </w:tc>
@@ -1175,8 +1135,9 @@
           <w:p>
             <w:r>
               <w:rPr>
-                <w:sz w:val="20"/>
-                <w:szCs w:val="20"/>
+                <w:rFonts w:ascii="Times New Roman" w:hAnsi="Times New Roman" w:cs="Times New Roman" w:eastAsia="Times New Roman"/>
+                <w:sz w:val="24"/>
+                <w:szCs w:val="24"/>
               </w:rPr>
               <w:t xml:space="preserve">8</w:t>
             </w:r>
@@ -1201,19 +1162,11 @@
           <w:p>
             <w:r>
               <w:rPr>
-                <w:b/>
-                <w:bCs/>
-                <w:sz w:val="20"/>
-                <w:szCs w:val="20"/>
-              </w:rPr>
-              <w:t xml:space="preserve">Northvane controls the other SAFEs.</w:t>
-            </w:r>
-            <w:r>
-              <w:rPr>
-                <w:sz w:val="20"/>
-                <w:szCs w:val="20"/>
-              </w:rPr>
-              <w:t xml:space="preserve"> It holds 60% of the $25M-cap SAFEs, so it can approve changes to Bramblewood's and the angels' SAFEs, and the side letter gives it a veto over any change to them.</w:t>
+                <w:rFonts w:ascii="Times New Roman" w:hAnsi="Times New Roman" w:cs="Times New Roman" w:eastAsia="Times New Roman"/>
+                <w:sz w:val="24"/>
+                <w:szCs w:val="24"/>
+              </w:rPr>
+              <w:t xml:space="preserve">Northvane gets a board observer now and a promised board seat later. It can also invest in competitors while seeing our board materials.</w:t>
             </w:r>
           </w:p>
         </w:tc>
@@ -1236,10 +1189,11 @@
           <w:p>
             <w:r>
               <w:rPr>
-                <w:sz w:val="20"/>
-                <w:szCs w:val="20"/>
-              </w:rPr>
-              <w:t xml:space="preserve">SAFE §5(a); Side letter §20(b)</w:t>
+                <w:rFonts w:ascii="Times New Roman" w:hAnsi="Times New Roman" w:cs="Times New Roman" w:eastAsia="Times New Roman"/>
+                <w:sz w:val="24"/>
+                <w:szCs w:val="24"/>
+              </w:rPr>
+              <w:t xml:space="preserve">Side letter §6, §15</w:t>
             </w:r>
           </w:p>
         </w:tc>
@@ -1291,8 +1245,9 @@
           <w:p>
             <w:r>
               <w:rPr>
-                <w:sz w:val="20"/>
-                <w:szCs w:val="20"/>
+                <w:rFonts w:ascii="Times New Roman" w:hAnsi="Times New Roman" w:cs="Times New Roman" w:eastAsia="Times New Roman"/>
+                <w:sz w:val="24"/>
+                <w:szCs w:val="24"/>
               </w:rPr>
               <w:t xml:space="preserve">9</w:t>
             </w:r>
@@ -1317,19 +1272,11 @@
           <w:p>
             <w:r>
               <w:rPr>
-                <w:b/>
-                <w:bCs/>
-                <w:sz w:val="20"/>
-                <w:szCs w:val="20"/>
-              </w:rPr>
-              <w:t xml:space="preserve">Pro rata rights go far beyond the YC pro rata letter.</w:t>
-            </w:r>
-            <w:r>
-              <w:rPr>
-                <w:sz w:val="20"/>
-                <w:szCs w:val="20"/>
-              </w:rPr>
-              <w:t xml:space="preserve"> The YC letter covers only the next priced round, ends there, and uses all shares including the option pool as the base. Northvane's covers every future round forever (including bridge SAFEs) and leaves the option pool out of the base, which makes its share bigger. It also gives a 20-day wait before closing and advance notice of any term sheet.</w:t>
+                <w:rFonts w:ascii="Times New Roman" w:hAnsi="Times New Roman" w:cs="Times New Roman" w:eastAsia="Times New Roman"/>
+                <w:sz w:val="24"/>
+                <w:szCs w:val="24"/>
+              </w:rPr>
+              <w:t xml:space="preserve">The side letter says it overrides the charter and any future deal documents. A Series A investor won't accept that.</w:t>
             </w:r>
           </w:p>
         </w:tc>
@@ -1352,10 +1299,11 @@
           <w:p>
             <w:r>
               <w:rPr>
-                <w:sz w:val="20"/>
-                <w:szCs w:val="20"/>
-              </w:rPr>
-              <w:t xml:space="preserve">Side letter §1; compare YC Pro Rata Side Letter</w:t>
+                <w:rFonts w:ascii="Times New Roman" w:hAnsi="Times New Roman" w:cs="Times New Roman" w:eastAsia="Times New Roman"/>
+                <w:sz w:val="24"/>
+                <w:szCs w:val="24"/>
+              </w:rPr>
+              <w:t xml:space="preserve">Side letter §20(a)</w:t>
             </w:r>
           </w:p>
         </w:tc>
@@ -1407,8 +1355,9 @@
           <w:p>
             <w:r>
               <w:rPr>
-                <w:sz w:val="20"/>
-                <w:szCs w:val="20"/>
+                <w:rFonts w:ascii="Times New Roman" w:hAnsi="Times New Roman" w:cs="Times New Roman" w:eastAsia="Times New Roman"/>
+                <w:sz w:val="24"/>
+                <w:szCs w:val="24"/>
               </w:rPr>
               <w:t xml:space="preserve">10</w:t>
             </w:r>
@@ -1433,19 +1382,11 @@
           <w:p>
             <w:r>
               <w:rPr>
-                <w:b/>
-                <w:bCs/>
-                <w:sz w:val="20"/>
-                <w:szCs w:val="20"/>
-              </w:rPr>
-              <w:t xml:space="preserve">Broad MFN.</w:t>
-            </w:r>
-            <w:r>
-              <w:rPr>
-                <w:sz w:val="20"/>
-                <w:szCs w:val="20"/>
-              </w:rPr>
-              <w:t xml:space="preserve"> Northvane can copy any better term given to any later investor, including stacking a discount on top of its cap.</w:t>
+                <w:rFonts w:ascii="Times New Roman" w:hAnsi="Times New Roman" w:cs="Times New Roman" w:eastAsia="Times New Roman"/>
+                <w:sz w:val="24"/>
+                <w:szCs w:val="24"/>
+              </w:rPr>
+              <w:t xml:space="preserve">Bramblewood and the angels share the same payout line as Northvane but don't know about its 2x. The side letter also stops the company from telling them.</w:t>
             </w:r>
           </w:p>
         </w:tc>
@@ -1468,10 +1409,11 @@
           <w:p>
             <w:r>
               <w:rPr>
-                <w:sz w:val="20"/>
-                <w:szCs w:val="20"/>
-              </w:rPr>
-              <w:t xml:space="preserve">Side letter §2</w:t>
+                <w:rFonts w:ascii="Times New Roman" w:hAnsi="Times New Roman" w:cs="Times New Roman" w:eastAsia="Times New Roman"/>
+                <w:sz w:val="24"/>
+                <w:szCs w:val="24"/>
+              </w:rPr>
+              <w:t xml:space="preserve">Side letter §18(b); SAFE §1(d)</w:t>
             </w:r>
           </w:p>
         </w:tc>
@@ -1523,8 +1465,9 @@
           <w:p>
             <w:r>
               <w:rPr>
-                <w:sz w:val="20"/>
-                <w:szCs w:val="20"/>
+                <w:rFonts w:ascii="Times New Roman" w:hAnsi="Times New Roman" w:cs="Times New Roman" w:eastAsia="Times New Roman"/>
+                <w:sz w:val="24"/>
+                <w:szCs w:val="24"/>
               </w:rPr>
               <w:t xml:space="preserve">11</w:t>
             </w:r>
@@ -1549,19 +1492,11 @@
           <w:p>
             <w:r>
               <w:rPr>
-                <w:b/>
-                <w:bCs/>
-                <w:sz w:val="20"/>
-                <w:szCs w:val="20"/>
-              </w:rPr>
-              <w:t xml:space="preserve">Board observer and a promised board seat.</w:t>
-            </w:r>
-            <w:r>
-              <w:rPr>
-                <w:sz w:val="20"/>
-                <w:szCs w:val="20"/>
-              </w:rPr>
-              <w:t xml:space="preserve"> Northvane gets an observer for as long as it holds anything, and a board seat in the Series A. It is also free to invest in competitors and can never be labeled a "Competitor," so it sees board materials while it can back rivals.</w:t>
+                <w:rFonts w:ascii="Times New Roman" w:hAnsi="Times New Roman" w:cs="Times New Roman" w:eastAsia="Times New Roman"/>
+                <w:sz w:val="24"/>
+                <w:szCs w:val="24"/>
+              </w:rPr>
+              <w:t xml:space="preserve">The founders are signing personally, and we represent the company, not them. They should get their own advice on the vesting change.</w:t>
             </w:r>
           </w:p>
         </w:tc>
@@ -1584,590 +1519,11 @@
           <w:p>
             <w:r>
               <w:rPr>
-                <w:sz w:val="20"/>
-                <w:szCs w:val="20"/>
-              </w:rPr>
-              <w:t xml:space="preserve">Side letter §6, §7(b), §15</w:t>
-            </w:r>
-          </w:p>
-        </w:tc>
-        <w:tc>
-          <w:tcPr>
-            <w:tcW w:w="900" w:type="dxa"/>
-            <w:tcBorders>
-              <w:top w:val="single" w:color="A6A6A6" w:sz="4" w:space="0"/>
-              <w:left w:val="single" w:color="A6A6A6" w:sz="4" w:space="0"/>
-              <w:bottom w:val="single" w:color="A6A6A6" w:sz="4" w:space="0"/>
-              <w:right w:val="single" w:color="A6A6A6" w:sz="4" w:space="0"/>
-            </w:tcBorders>
-            <w:tcMar>
-              <w:top w:w="60" w:type="dxa"/>
-              <w:left w:w="100" w:type="dxa"/>
-              <w:bottom w:w="60" w:type="dxa"/>
-              <w:right w:w="100" w:type="dxa"/>
-            </w:tcMar>
-          </w:tcPr>
-          <w:p/>
-        </w:tc>
-      </w:tr>
-      <w:tr>
-        <w:tblPrEx>
-          <w:tblCellMar>
-            <w:top w:w="0" w:type="dxa"/>
-            <w:bottom w:w="0" w:type="dxa"/>
-          </w:tblCellMar>
-        </w:tblPrEx>
-        <w:trPr>
-          <w:trHeight w:val="380"/>
-        </w:trPr>
-        <w:tc>
-          <w:tcPr>
-            <w:tcW w:w="500" w:type="dxa"/>
-            <w:tcBorders>
-              <w:top w:val="single" w:color="A6A6A6" w:sz="4" w:space="0"/>
-              <w:left w:val="single" w:color="A6A6A6" w:sz="4" w:space="0"/>
-              <w:bottom w:val="single" w:color="A6A6A6" w:sz="4" w:space="0"/>
-              <w:right w:val="single" w:color="A6A6A6" w:sz="4" w:space="0"/>
-            </w:tcBorders>
-            <w:tcMar>
-              <w:top w:w="60" w:type="dxa"/>
-              <w:left w:w="100" w:type="dxa"/>
-              <w:bottom w:w="60" w:type="dxa"/>
-              <w:right w:w="100" w:type="dxa"/>
-            </w:tcMar>
-          </w:tcPr>
-          <w:p>
-            <w:r>
-              <w:rPr>
-                <w:sz w:val="20"/>
-                <w:szCs w:val="20"/>
-              </w:rPr>
-              <w:t xml:space="preserve">12</w:t>
-            </w:r>
-          </w:p>
-        </w:tc>
-        <w:tc>
-          <w:tcPr>
-            <w:tcW w:w="5420" w:type="dxa"/>
-            <w:tcBorders>
-              <w:top w:val="single" w:color="A6A6A6" w:sz="4" w:space="0"/>
-              <w:left w:val="single" w:color="A6A6A6" w:sz="4" w:space="0"/>
-              <w:bottom w:val="single" w:color="A6A6A6" w:sz="4" w:space="0"/>
-              <w:right w:val="single" w:color="A6A6A6" w:sz="4" w:space="0"/>
-            </w:tcBorders>
-            <w:tcMar>
-              <w:top w:w="60" w:type="dxa"/>
-              <w:left w:w="100" w:type="dxa"/>
-              <w:bottom w:w="60" w:type="dxa"/>
-              <w:right w:w="100" w:type="dxa"/>
-            </w:tcMar>
-          </w:tcPr>
-          <w:p>
-            <w:r>
-              <w:rPr>
-                <w:b/>
-                <w:bCs/>
-                <w:sz w:val="20"/>
-                <w:szCs w:val="20"/>
-              </w:rPr>
-              <w:t xml:space="preserve">Heavy reporting for a 5-person company.</w:t>
-            </w:r>
-            <w:r>
-              <w:rPr>
-                <w:sz w:val="20"/>
-                <w:szCs w:val="20"/>
-              </w:rPr>
-              <w:t xml:space="preserve"> Monthly budgets, customer data, pitch decks, and advance drafts of any sale documents. The basic financials and cap table are fine.</w:t>
-            </w:r>
-          </w:p>
-        </w:tc>
-        <w:tc>
-          <w:tcPr>
-            <w:tcW w:w="2900" w:type="dxa"/>
-            <w:tcBorders>
-              <w:top w:val="single" w:color="A6A6A6" w:sz="4" w:space="0"/>
-              <w:left w:val="single" w:color="A6A6A6" w:sz="4" w:space="0"/>
-              <w:bottom w:val="single" w:color="A6A6A6" w:sz="4" w:space="0"/>
-              <w:right w:val="single" w:color="A6A6A6" w:sz="4" w:space="0"/>
-            </w:tcBorders>
-            <w:tcMar>
-              <w:top w:w="60" w:type="dxa"/>
-              <w:left w:w="100" w:type="dxa"/>
-              <w:bottom w:w="60" w:type="dxa"/>
-              <w:right w:w="100" w:type="dxa"/>
-            </w:tcMar>
-          </w:tcPr>
-          <w:p>
-            <w:r>
-              <w:rPr>
-                <w:sz w:val="20"/>
-                <w:szCs w:val="20"/>
-              </w:rPr>
-              <w:t xml:space="preserve">Side letter §4, §5</w:t>
-            </w:r>
-          </w:p>
-        </w:tc>
-        <w:tc>
-          <w:tcPr>
-            <w:tcW w:w="900" w:type="dxa"/>
-            <w:tcBorders>
-              <w:top w:val="single" w:color="A6A6A6" w:sz="4" w:space="0"/>
-              <w:left w:val="single" w:color="A6A6A6" w:sz="4" w:space="0"/>
-              <w:bottom w:val="single" w:color="A6A6A6" w:sz="4" w:space="0"/>
-              <w:right w:val="single" w:color="A6A6A6" w:sz="4" w:space="0"/>
-            </w:tcBorders>
-            <w:tcMar>
-              <w:top w:w="60" w:type="dxa"/>
-              <w:left w:w="100" w:type="dxa"/>
-              <w:bottom w:w="60" w:type="dxa"/>
-              <w:right w:w="100" w:type="dxa"/>
-            </w:tcMar>
-          </w:tcPr>
-          <w:p/>
-        </w:tc>
-      </w:tr>
-      <w:tr>
-        <w:tblPrEx>
-          <w:tblCellMar>
-            <w:top w:w="0" w:type="dxa"/>
-            <w:bottom w:w="0" w:type="dxa"/>
-          </w:tblCellMar>
-        </w:tblPrEx>
-        <w:trPr>
-          <w:trHeight w:val="380"/>
-        </w:trPr>
-        <w:tc>
-          <w:tcPr>
-            <w:tcW w:w="500" w:type="dxa"/>
-            <w:tcBorders>
-              <w:top w:val="single" w:color="A6A6A6" w:sz="4" w:space="0"/>
-              <w:left w:val="single" w:color="A6A6A6" w:sz="4" w:space="0"/>
-              <w:bottom w:val="single" w:color="A6A6A6" w:sz="4" w:space="0"/>
-              <w:right w:val="single" w:color="A6A6A6" w:sz="4" w:space="0"/>
-            </w:tcBorders>
-            <w:tcMar>
-              <w:top w:w="60" w:type="dxa"/>
-              <w:left w:w="100" w:type="dxa"/>
-              <w:bottom w:w="60" w:type="dxa"/>
-              <w:right w:w="100" w:type="dxa"/>
-            </w:tcMar>
-          </w:tcPr>
-          <w:p>
-            <w:r>
-              <w:rPr>
-                <w:sz w:val="20"/>
-                <w:szCs w:val="20"/>
-              </w:rPr>
-              <w:t xml:space="preserve">13</w:t>
-            </w:r>
-          </w:p>
-        </w:tc>
-        <w:tc>
-          <w:tcPr>
-            <w:tcW w:w="5420" w:type="dxa"/>
-            <w:tcBorders>
-              <w:top w:val="single" w:color="A6A6A6" w:sz="4" w:space="0"/>
-              <w:left w:val="single" w:color="A6A6A6" w:sz="4" w:space="0"/>
-              <w:bottom w:val="single" w:color="A6A6A6" w:sz="4" w:space="0"/>
-              <w:right w:val="single" w:color="A6A6A6" w:sz="4" w:space="0"/>
-            </w:tcBorders>
-            <w:tcMar>
-              <w:top w:w="60" w:type="dxa"/>
-              <w:left w:w="100" w:type="dxa"/>
-              <w:bottom w:w="60" w:type="dxa"/>
-              <w:right w:w="100" w:type="dxa"/>
-            </w:tcMar>
-          </w:tcPr>
-          <w:p>
-            <w:r>
-              <w:rPr>
-                <w:b/>
-                <w:bCs/>
-                <w:sz w:val="20"/>
-                <w:szCs w:val="20"/>
-              </w:rPr>
-              <w:t xml:space="preserve">The side letter overrides everything and never ends.</w:t>
-            </w:r>
-            <w:r>
-              <w:rPr>
-                <w:sz w:val="20"/>
-                <w:szCs w:val="20"/>
-              </w:rPr>
-              <w:t xml:space="preserve"> It claims to beat the charter and the future Series A documents, and Northvane can transfer it to anyone. The YC letter ends at the Series A and can't be assigned without consent.</w:t>
-            </w:r>
-          </w:p>
-        </w:tc>
-        <w:tc>
-          <w:tcPr>
-            <w:tcW w:w="2900" w:type="dxa"/>
-            <w:tcBorders>
-              <w:top w:val="single" w:color="A6A6A6" w:sz="4" w:space="0"/>
-              <w:left w:val="single" w:color="A6A6A6" w:sz="4" w:space="0"/>
-              <w:bottom w:val="single" w:color="A6A6A6" w:sz="4" w:space="0"/>
-              <w:right w:val="single" w:color="A6A6A6" w:sz="4" w:space="0"/>
-            </w:tcBorders>
-            <w:tcMar>
-              <w:top w:w="60" w:type="dxa"/>
-              <w:left w:w="100" w:type="dxa"/>
-              <w:bottom w:w="60" w:type="dxa"/>
-              <w:right w:w="100" w:type="dxa"/>
-            </w:tcMar>
-          </w:tcPr>
-          <w:p>
-            <w:r>
-              <w:rPr>
-                <w:sz w:val="20"/>
-                <w:szCs w:val="20"/>
-              </w:rPr>
-              <w:t xml:space="preserve">Side letter §19, §20(a), §20(c)</w:t>
-            </w:r>
-          </w:p>
-        </w:tc>
-        <w:tc>
-          <w:tcPr>
-            <w:tcW w:w="900" w:type="dxa"/>
-            <w:tcBorders>
-              <w:top w:val="single" w:color="A6A6A6" w:sz="4" w:space="0"/>
-              <w:left w:val="single" w:color="A6A6A6" w:sz="4" w:space="0"/>
-              <w:bottom w:val="single" w:color="A6A6A6" w:sz="4" w:space="0"/>
-              <w:right w:val="single" w:color="A6A6A6" w:sz="4" w:space="0"/>
-            </w:tcBorders>
-            <w:tcMar>
-              <w:top w:w="60" w:type="dxa"/>
-              <w:left w:w="100" w:type="dxa"/>
-              <w:bottom w:w="60" w:type="dxa"/>
-              <w:right w:w="100" w:type="dxa"/>
-            </w:tcMar>
-          </w:tcPr>
-          <w:p/>
-        </w:tc>
-      </w:tr>
-      <w:tr>
-        <w:tblPrEx>
-          <w:tblCellMar>
-            <w:top w:w="0" w:type="dxa"/>
-            <w:bottom w:w="0" w:type="dxa"/>
-          </w:tblCellMar>
-        </w:tblPrEx>
-        <w:trPr>
-          <w:trHeight w:val="380"/>
-        </w:trPr>
-        <w:tc>
-          <w:tcPr>
-            <w:tcW w:w="500" w:type="dxa"/>
-            <w:tcBorders>
-              <w:top w:val="single" w:color="A6A6A6" w:sz="4" w:space="0"/>
-              <w:left w:val="single" w:color="A6A6A6" w:sz="4" w:space="0"/>
-              <w:bottom w:val="single" w:color="A6A6A6" w:sz="4" w:space="0"/>
-              <w:right w:val="single" w:color="A6A6A6" w:sz="4" w:space="0"/>
-            </w:tcBorders>
-            <w:tcMar>
-              <w:top w:w="60" w:type="dxa"/>
-              <w:left w:w="100" w:type="dxa"/>
-              <w:bottom w:w="60" w:type="dxa"/>
-              <w:right w:w="100" w:type="dxa"/>
-            </w:tcMar>
-          </w:tcPr>
-          <w:p>
-            <w:r>
-              <w:rPr>
-                <w:sz w:val="20"/>
-                <w:szCs w:val="20"/>
-              </w:rPr>
-              <w:t xml:space="preserve">14</w:t>
-            </w:r>
-          </w:p>
-        </w:tc>
-        <w:tc>
-          <w:tcPr>
-            <w:tcW w:w="5420" w:type="dxa"/>
-            <w:tcBorders>
-              <w:top w:val="single" w:color="A6A6A6" w:sz="4" w:space="0"/>
-              <w:left w:val="single" w:color="A6A6A6" w:sz="4" w:space="0"/>
-              <w:bottom w:val="single" w:color="A6A6A6" w:sz="4" w:space="0"/>
-              <w:right w:val="single" w:color="A6A6A6" w:sz="4" w:space="0"/>
-            </w:tcBorders>
-            <w:tcMar>
-              <w:top w:w="60" w:type="dxa"/>
-              <w:left w:w="100" w:type="dxa"/>
-              <w:bottom w:w="60" w:type="dxa"/>
-              <w:right w:w="100" w:type="dxa"/>
-            </w:tcMar>
-          </w:tcPr>
-          <w:p>
-            <w:r>
-              <w:rPr>
-                <w:b/>
-                <w:bCs/>
-                <w:sz w:val="20"/>
-                <w:szCs w:val="20"/>
-              </w:rPr>
-              <w:t xml:space="preserve">The other investors aren't told.</w:t>
-            </w:r>
-            <w:r>
-              <w:rPr>
-                <w:sz w:val="20"/>
-                <w:szCs w:val="20"/>
-              </w:rPr>
-              <w:t xml:space="preserve"> Bramblewood and the angels rank equally with Northvane's hidden 2x payout, and the side letter bars the company from telling them. That creates securities-fraud risk.</w:t>
-            </w:r>
-          </w:p>
-        </w:tc>
-        <w:tc>
-          <w:tcPr>
-            <w:tcW w:w="2900" w:type="dxa"/>
-            <w:tcBorders>
-              <w:top w:val="single" w:color="A6A6A6" w:sz="4" w:space="0"/>
-              <w:left w:val="single" w:color="A6A6A6" w:sz="4" w:space="0"/>
-              <w:bottom w:val="single" w:color="A6A6A6" w:sz="4" w:space="0"/>
-              <w:right w:val="single" w:color="A6A6A6" w:sz="4" w:space="0"/>
-            </w:tcBorders>
-            <w:tcMar>
-              <w:top w:w="60" w:type="dxa"/>
-              <w:left w:w="100" w:type="dxa"/>
-              <w:bottom w:w="60" w:type="dxa"/>
-              <w:right w:w="100" w:type="dxa"/>
-            </w:tcMar>
-          </w:tcPr>
-          <w:p>
-            <w:r>
-              <w:rPr>
-                <w:sz w:val="20"/>
-                <w:szCs w:val="20"/>
-              </w:rPr>
-              <w:t xml:space="preserve">Side letter §18(b), §14(b)</w:t>
-            </w:r>
-          </w:p>
-        </w:tc>
-        <w:tc>
-          <w:tcPr>
-            <w:tcW w:w="900" w:type="dxa"/>
-            <w:tcBorders>
-              <w:top w:val="single" w:color="A6A6A6" w:sz="4" w:space="0"/>
-              <w:left w:val="single" w:color="A6A6A6" w:sz="4" w:space="0"/>
-              <w:bottom w:val="single" w:color="A6A6A6" w:sz="4" w:space="0"/>
-              <w:right w:val="single" w:color="A6A6A6" w:sz="4" w:space="0"/>
-            </w:tcBorders>
-            <w:tcMar>
-              <w:top w:w="60" w:type="dxa"/>
-              <w:left w:w="100" w:type="dxa"/>
-              <w:bottom w:w="60" w:type="dxa"/>
-              <w:right w:w="100" w:type="dxa"/>
-            </w:tcMar>
-          </w:tcPr>
-          <w:p/>
-        </w:tc>
-      </w:tr>
-      <w:tr>
-        <w:tblPrEx>
-          <w:tblCellMar>
-            <w:top w:w="0" w:type="dxa"/>
-            <w:bottom w:w="0" w:type="dxa"/>
-          </w:tblCellMar>
-        </w:tblPrEx>
-        <w:trPr>
-          <w:trHeight w:val="380"/>
-        </w:trPr>
-        <w:tc>
-          <w:tcPr>
-            <w:tcW w:w="500" w:type="dxa"/>
-            <w:tcBorders>
-              <w:top w:val="single" w:color="A6A6A6" w:sz="4" w:space="0"/>
-              <w:left w:val="single" w:color="A6A6A6" w:sz="4" w:space="0"/>
-              <w:bottom w:val="single" w:color="A6A6A6" w:sz="4" w:space="0"/>
-              <w:right w:val="single" w:color="A6A6A6" w:sz="4" w:space="0"/>
-            </w:tcBorders>
-            <w:tcMar>
-              <w:top w:w="60" w:type="dxa"/>
-              <w:left w:w="100" w:type="dxa"/>
-              <w:bottom w:w="60" w:type="dxa"/>
-              <w:right w:w="100" w:type="dxa"/>
-            </w:tcMar>
-          </w:tcPr>
-          <w:p>
-            <w:r>
-              <w:rPr>
-                <w:sz w:val="20"/>
-                <w:szCs w:val="20"/>
-              </w:rPr>
-              <w:t xml:space="preserve">15</w:t>
-            </w:r>
-          </w:p>
-        </w:tc>
-        <w:tc>
-          <w:tcPr>
-            <w:tcW w:w="5420" w:type="dxa"/>
-            <w:tcBorders>
-              <w:top w:val="single" w:color="A6A6A6" w:sz="4" w:space="0"/>
-              <w:left w:val="single" w:color="A6A6A6" w:sz="4" w:space="0"/>
-              <w:bottom w:val="single" w:color="A6A6A6" w:sz="4" w:space="0"/>
-              <w:right w:val="single" w:color="A6A6A6" w:sz="4" w:space="0"/>
-            </w:tcBorders>
-            <w:tcMar>
-              <w:top w:w="60" w:type="dxa"/>
-              <w:left w:w="100" w:type="dxa"/>
-              <w:bottom w:w="60" w:type="dxa"/>
-              <w:right w:w="100" w:type="dxa"/>
-            </w:tcMar>
-          </w:tcPr>
-          <w:p>
-            <w:r>
-              <w:rPr>
-                <w:b/>
-                <w:bCs/>
-                <w:sz w:val="20"/>
-                <w:szCs w:val="20"/>
-              </w:rPr>
-              <w:t xml:space="preserve">Smaller items.</w:t>
-            </w:r>
-            <w:r>
-              <w:rPr>
-                <w:sz w:val="20"/>
-                <w:szCs w:val="20"/>
-              </w:rPr>
-              <w:t xml:space="preserve"> Strict vesting rules for all employee grants (§9(a)). Broad permits rep (§11). Undefined "customary" anti-dilution (§7(a)). The company pays $10K + $5K of Northvane's legal fees (§17). Board approval is needed before signing (§14(a)).</w:t>
-            </w:r>
-          </w:p>
-        </w:tc>
-        <w:tc>
-          <w:tcPr>
-            <w:tcW w:w="2900" w:type="dxa"/>
-            <w:tcBorders>
-              <w:top w:val="single" w:color="A6A6A6" w:sz="4" w:space="0"/>
-              <w:left w:val="single" w:color="A6A6A6" w:sz="4" w:space="0"/>
-              <w:bottom w:val="single" w:color="A6A6A6" w:sz="4" w:space="0"/>
-              <w:right w:val="single" w:color="A6A6A6" w:sz="4" w:space="0"/>
-            </w:tcBorders>
-            <w:tcMar>
-              <w:top w:w="60" w:type="dxa"/>
-              <w:left w:w="100" w:type="dxa"/>
-              <w:bottom w:w="60" w:type="dxa"/>
-              <w:right w:w="100" w:type="dxa"/>
-            </w:tcMar>
-          </w:tcPr>
-          <w:p>
-            <w:r>
-              <w:rPr>
-                <w:sz w:val="20"/>
-                <w:szCs w:val="20"/>
-              </w:rPr>
-              <w:t xml:space="preserve">Side letter §7(a), §9(a), §11, §14(a), §17</w:t>
-            </w:r>
-          </w:p>
-        </w:tc>
-        <w:tc>
-          <w:tcPr>
-            <w:tcW w:w="900" w:type="dxa"/>
-            <w:tcBorders>
-              <w:top w:val="single" w:color="A6A6A6" w:sz="4" w:space="0"/>
-              <w:left w:val="single" w:color="A6A6A6" w:sz="4" w:space="0"/>
-              <w:bottom w:val="single" w:color="A6A6A6" w:sz="4" w:space="0"/>
-              <w:right w:val="single" w:color="A6A6A6" w:sz="4" w:space="0"/>
-            </w:tcBorders>
-            <w:tcMar>
-              <w:top w:w="60" w:type="dxa"/>
-              <w:left w:w="100" w:type="dxa"/>
-              <w:bottom w:w="60" w:type="dxa"/>
-              <w:right w:w="100" w:type="dxa"/>
-            </w:tcMar>
-          </w:tcPr>
-          <w:p/>
-        </w:tc>
-      </w:tr>
-      <w:tr>
-        <w:tblPrEx>
-          <w:tblCellMar>
-            <w:top w:w="0" w:type="dxa"/>
-            <w:bottom w:w="0" w:type="dxa"/>
-          </w:tblCellMar>
-        </w:tblPrEx>
-        <w:trPr>
-          <w:trHeight w:val="380"/>
-        </w:trPr>
-        <w:tc>
-          <w:tcPr>
-            <w:tcW w:w="500" w:type="dxa"/>
-            <w:tcBorders>
-              <w:top w:val="single" w:color="A6A6A6" w:sz="4" w:space="0"/>
-              <w:left w:val="single" w:color="A6A6A6" w:sz="4" w:space="0"/>
-              <w:bottom w:val="single" w:color="A6A6A6" w:sz="4" w:space="0"/>
-              <w:right w:val="single" w:color="A6A6A6" w:sz="4" w:space="0"/>
-            </w:tcBorders>
-            <w:tcMar>
-              <w:top w:w="60" w:type="dxa"/>
-              <w:left w:w="100" w:type="dxa"/>
-              <w:bottom w:w="60" w:type="dxa"/>
-              <w:right w:w="100" w:type="dxa"/>
-            </w:tcMar>
-          </w:tcPr>
-          <w:p>
-            <w:r>
-              <w:rPr>
-                <w:sz w:val="20"/>
-                <w:szCs w:val="20"/>
-              </w:rPr>
-              <w:t xml:space="preserve">16</w:t>
-            </w:r>
-          </w:p>
-        </w:tc>
-        <w:tc>
-          <w:tcPr>
-            <w:tcW w:w="5420" w:type="dxa"/>
-            <w:tcBorders>
-              <w:top w:val="single" w:color="A6A6A6" w:sz="4" w:space="0"/>
-              <w:left w:val="single" w:color="A6A6A6" w:sz="4" w:space="0"/>
-              <w:bottom w:val="single" w:color="A6A6A6" w:sz="4" w:space="0"/>
-              <w:right w:val="single" w:color="A6A6A6" w:sz="4" w:space="0"/>
-            </w:tcBorders>
-            <w:tcMar>
-              <w:top w:w="60" w:type="dxa"/>
-              <w:left w:w="100" w:type="dxa"/>
-              <w:bottom w:w="60" w:type="dxa"/>
-              <w:right w:w="100" w:type="dxa"/>
-            </w:tcMar>
-          </w:tcPr>
-          <w:p>
-            <w:r>
-              <w:rPr>
-                <w:b/>
-                <w:bCs/>
-                <w:sz w:val="20"/>
-                <w:szCs w:val="20"/>
-              </w:rPr>
-              <w:t xml:space="preserve">Don't rush for Monday.</w:t>
-            </w:r>
-            <w:r>
-              <w:rPr>
-                <w:sz w:val="20"/>
-                <w:szCs w:val="20"/>
-              </w:rPr>
-              <w:t xml:space="preserve"> That date serves Dana's LP meeting. Bramblewood offered the same $25M cap on clean YC terms, which gives Alex leverage.</w:t>
-            </w:r>
-          </w:p>
-        </w:tc>
-        <w:tc>
-          <w:tcPr>
-            <w:tcW w:w="2900" w:type="dxa"/>
-            <w:tcBorders>
-              <w:top w:val="single" w:color="A6A6A6" w:sz="4" w:space="0"/>
-              <w:left w:val="single" w:color="A6A6A6" w:sz="4" w:space="0"/>
-              <w:bottom w:val="single" w:color="A6A6A6" w:sz="4" w:space="0"/>
-              <w:right w:val="single" w:color="A6A6A6" w:sz="4" w:space="0"/>
-            </w:tcBorders>
-            <w:tcMar>
-              <w:top w:w="60" w:type="dxa"/>
-              <w:left w:w="100" w:type="dxa"/>
-              <w:bottom w:w="60" w:type="dxa"/>
-              <w:right w:w="100" w:type="dxa"/>
-            </w:tcMar>
-          </w:tcPr>
-          <w:p>
-            <w:r>
-              <w:rPr>
-                <w:sz w:val="20"/>
-                <w:szCs w:val="20"/>
-              </w:rPr>
-              <w:t xml:space="preserve">Both emails; Background</w:t>
+                <w:rFonts w:ascii="Times New Roman" w:hAnsi="Times New Roman" w:cs="Times New Roman" w:eastAsia="Times New Roman"/>
+                <w:sz w:val="24"/>
+                <w:szCs w:val="24"/>
+              </w:rPr>
+              <w:t xml:space="preserve">Side letter signature page</w:t>
             </w:r>
           </w:p>
         </w:tc>
@@ -2394,8 +1750,9 @@
           <w:p>
             <w:r>
               <w:rPr>
-                <w:sz w:val="20"/>
-                <w:szCs w:val="20"/>
+                <w:rFonts w:ascii="Times New Roman" w:hAnsi="Times New Roman" w:cs="Times New Roman" w:eastAsia="Times New Roman"/>
+                <w:sz w:val="24"/>
+                <w:szCs w:val="24"/>
               </w:rPr>
               <w:t xml:space="preserve">1</w:t>
             </w:r>
@@ -2420,19 +1777,11 @@
           <w:p>
             <w:r>
               <w:rPr>
-                <w:b/>
-                <w:bCs/>
-                <w:sz w:val="20"/>
-                <w:szCs w:val="20"/>
-              </w:rPr>
-              <w:t xml:space="preserve">Fix the SAFE back to the real YC form.</w:t>
-            </w:r>
-            <w:r>
-              <w:rPr>
-                <w:sz w:val="20"/>
-                <w:szCs w:val="20"/>
-              </w:rPr>
-              <w:t xml:space="preserve"> SAFE §1(a)(2), §1(b)-(c), §2</w:t>
+                <w:rFonts w:ascii="Times New Roman" w:hAnsi="Times New Roman" w:cs="Times New Roman" w:eastAsia="Times New Roman"/>
+                <w:sz w:val="24"/>
+                <w:szCs w:val="24"/>
+              </w:rPr>
+              <w:t xml:space="preserve">Change the SAFE back to the real YC form. (SAFE §1(a)(2), §1(b)-(c), §2)</w:t>
             </w:r>
           </w:p>
         </w:tc>
@@ -2453,33 +1802,13 @@
             </w:tcMar>
           </w:tcPr>
           <w:p>
-            <w:pPr>
-              <w:spacing w:after="80"/>
-            </w:pPr>
-            <w:r>
-              <w:rPr>
-                <w:sz w:val="20"/>
-                <w:szCs w:val="20"/>
-              </w:rPr>
-              <w:t xml:space="preserve">Northvane gets 2x its money first, a bigger preference in the Series A, and a SAFE that skips small rounds.</w:t>
-            </w:r>
-          </w:p>
-          <w:p>
-            <w:r>
-              <w:rPr>
-                <w:b/>
-                <w:bCs/>
-                <w:sz w:val="20"/>
-                <w:szCs w:val="20"/>
-              </w:rPr>
-              <w:t xml:space="preserve">For Alex:</w:t>
-            </w:r>
-            <w:r>
-              <w:rPr>
-                <w:sz w:val="20"/>
-                <w:szCs w:val="20"/>
-              </w:rPr>
-              <w:t xml:space="preserve"> "In any sale under ~$50M, Northvane takes $3M before you see a dollar." In a $10M sale, Alex loses ~$800K and Priya ~$600K.</w:t>
+            <w:r>
+              <w:rPr>
+                <w:rFonts w:ascii="Times New Roman" w:hAnsi="Times New Roman" w:cs="Times New Roman" w:eastAsia="Times New Roman"/>
+                <w:sz w:val="24"/>
+                <w:szCs w:val="24"/>
+              </w:rPr>
+              <w:t xml:space="preserve">Northvane gets paid twice its money before the founders in any sale under about $50M. In a $10M sale, Alex loses roughly $800K.</w:t>
             </w:r>
           </w:p>
         </w:tc>
@@ -2502,10 +1831,11 @@
           <w:p>
             <w:r>
               <w:rPr>
-                <w:sz w:val="20"/>
-                <w:szCs w:val="20"/>
-              </w:rPr>
-              <w:t xml:space="preserve">Use the unmodified YC SAFE: 1x, "Safe Preferred," no $5M minimum. Dana already says it's the standard form, so we're only asking her to make that true. It also matches Bramblewood's and the angels' terms.</w:t>
+                <w:rFonts w:ascii="Times New Roman" w:hAnsi="Times New Roman" w:cs="Times New Roman" w:eastAsia="Times New Roman"/>
+                <w:sz w:val="24"/>
+                <w:szCs w:val="24"/>
+              </w:rPr>
+              <w:t xml:space="preserve">Use the unmodified YC SAFE, same as Bramblewood and the angels. Dana already called it standard, so we're just asking her to make that true.</w:t>
             </w:r>
           </w:p>
         </w:tc>
@@ -2539,8 +1869,9 @@
           <w:p>
             <w:r>
               <w:rPr>
-                <w:sz w:val="20"/>
-                <w:szCs w:val="20"/>
+                <w:rFonts w:ascii="Times New Roman" w:hAnsi="Times New Roman" w:cs="Times New Roman" w:eastAsia="Times New Roman"/>
+                <w:sz w:val="24"/>
+                <w:szCs w:val="24"/>
               </w:rPr>
               <w:t xml:space="preserve">2</w:t>
             </w:r>
@@ -2565,19 +1896,11 @@
           <w:p>
             <w:r>
               <w:rPr>
-                <w:b/>
-                <w:bCs/>
-                <w:sz w:val="20"/>
-                <w:szCs w:val="20"/>
-              </w:rPr>
-              <w:t xml:space="preserve">Founder re-vesting.</w:t>
-            </w:r>
-            <w:r>
-              <w:rPr>
-                <w:sz w:val="20"/>
-                <w:szCs w:val="20"/>
-              </w:rPr>
-              <w:t xml:space="preserve"> Side letter §9(b)</w:t>
+                <w:rFonts w:ascii="Times New Roman" w:hAnsi="Times New Roman" w:cs="Times New Roman" w:eastAsia="Times New Roman"/>
+                <w:sz w:val="24"/>
+                <w:szCs w:val="24"/>
+              </w:rPr>
+              <w:t xml:space="preserve">Founder re-vesting. (Side letter §9(b))</w:t>
             </w:r>
           </w:p>
         </w:tc>
@@ -2598,33 +1921,13 @@
             </w:tcMar>
           </w:tcPr>
           <w:p>
-            <w:pPr>
-              <w:spacing w:after="80"/>
-            </w:pPr>
-            <w:r>
-              <w:rPr>
-                <w:sz w:val="20"/>
-                <w:szCs w:val="20"/>
-              </w:rPr>
-              <w:t xml:space="preserve">Resets both founders to 0% vested for 4 more years and weakens their acceleration on a sale.</w:t>
-            </w:r>
-          </w:p>
-          <w:p>
-            <w:r>
-              <w:rPr>
-                <w:b/>
-                <w:bCs/>
-                <w:sz w:val="20"/>
-                <w:szCs w:val="20"/>
-              </w:rPr>
-              <w:t xml:space="preserve">For Alex:</w:t>
-            </w:r>
-            <w:r>
-              <w:rPr>
-                <w:sz w:val="20"/>
-                <w:szCs w:val="20"/>
-              </w:rPr>
-              <w:t xml:space="preserve"> About 4.16M already-earned shares go back at risk. If Priya left in a year, she'd keep ~875K shares instead of ~2.7M.</w:t>
+            <w:r>
+              <w:rPr>
+                <w:rFonts w:ascii="Times New Roman" w:hAnsi="Times New Roman" w:cs="Times New Roman" w:eastAsia="Times New Roman"/>
+                <w:sz w:val="24"/>
+                <w:szCs w:val="24"/>
+              </w:rPr>
+              <w:t xml:space="preserve">Alex and Priya lose about two years of vesting, roughly 4M earned shares. If Priya left next year, she'd keep about 875K shares instead of 2.7M.</w:t>
             </w:r>
           </w:p>
         </w:tc>
@@ -2647,10 +1950,11 @@
           <w:p>
             <w:r>
               <w:rPr>
-                <w:sz w:val="20"/>
-                <w:szCs w:val="20"/>
-              </w:rPr>
-              <w:t xml:space="preserve">Delete it. The founders still have ~48% unvested, which already keeps them in place. Fallback: credit time already served, and revisit at the Series A.</w:t>
+                <w:rFonts w:ascii="Times New Roman" w:hAnsi="Times New Roman" w:cs="Times New Roman" w:eastAsia="Times New Roman"/>
+                <w:sz w:val="24"/>
+                <w:szCs w:val="24"/>
+              </w:rPr>
+              <w:t xml:space="preserve">Strike it, since they're still about half unvested. If Dana insists, give them credit for time already served.</w:t>
             </w:r>
           </w:p>
         </w:tc>
@@ -2684,8 +1988,9 @@
           <w:p>
             <w:r>
               <w:rPr>
-                <w:sz w:val="20"/>
-                <w:szCs w:val="20"/>
+                <w:rFonts w:ascii="Times New Roman" w:hAnsi="Times New Roman" w:cs="Times New Roman" w:eastAsia="Times New Roman"/>
+                <w:sz w:val="24"/>
+                <w:szCs w:val="24"/>
               </w:rPr>
               <w:t xml:space="preserve">3</w:t>
             </w:r>
@@ -2710,19 +2015,11 @@
           <w:p>
             <w:r>
               <w:rPr>
-                <w:b/>
-                <w:bCs/>
-                <w:sz w:val="20"/>
-                <w:szCs w:val="20"/>
-              </w:rPr>
-              <w:t xml:space="preserve">Vetoes and the "override everything" clause.</w:t>
-            </w:r>
-            <w:r>
-              <w:rPr>
-                <w:sz w:val="20"/>
-                <w:szCs w:val="20"/>
-              </w:rPr>
-              <w:t xml:space="preserve"> Side letter §8, §9(d), §20(a)-(b)</w:t>
+                <w:rFonts w:ascii="Times New Roman" w:hAnsi="Times New Roman" w:cs="Times New Roman" w:eastAsia="Times New Roman"/>
+                <w:sz w:val="24"/>
+                <w:szCs w:val="24"/>
+              </w:rPr>
+              <w:t xml:space="preserve">Northvane's vetoes. (Side letter §8, §9(d))</w:t>
             </w:r>
           </w:p>
         </w:tc>
@@ -2743,33 +2040,13 @@
             </w:tcMar>
           </w:tcPr>
           <w:p>
-            <w:pPr>
-              <w:spacing w:after="80"/>
-            </w:pPr>
-            <w:r>
-              <w:rPr>
-                <w:sz w:val="20"/>
-                <w:szCs w:val="20"/>
-              </w:rPr>
-              <w:t xml:space="preserve">Lets one SAFE investor block a sale, a small round, or a bigger option pool, and beats even the charter.</w:t>
-            </w:r>
-          </w:p>
-          <w:p>
-            <w:r>
-              <w:rPr>
-                <w:b/>
-                <w:bCs/>
-                <w:sz w:val="20"/>
-                <w:szCs w:val="20"/>
-              </w:rPr>
-              <w:t xml:space="preserve">For Alex:</w:t>
-            </w:r>
-            <w:r>
-              <w:rPr>
-                <w:sz w:val="20"/>
-                <w:szCs w:val="20"/>
-              </w:rPr>
-              <w:t xml:space="preserve"> "Dana could block a $20M acquisition offer that you, Priya and Bramblewood all want."</w:t>
+            <w:r>
+              <w:rPr>
+                <w:rFonts w:ascii="Times New Roman" w:hAnsi="Times New Roman" w:cs="Times New Roman" w:eastAsia="Times New Roman"/>
+                <w:sz w:val="24"/>
+                <w:szCs w:val="24"/>
+              </w:rPr>
+              <w:t xml:space="preserve">Dana could block a sale or a new round that everyone else wants. That's board-level control from a $1.5M SAFE.</w:t>
             </w:r>
           </w:p>
         </w:tc>
@@ -2792,10 +2069,11 @@
           <w:p>
             <w:r>
               <w:rPr>
-                <w:sz w:val="20"/>
-                <w:szCs w:val="20"/>
-              </w:rPr>
-              <w:t xml:space="preserve">Delete them. Bramblewood didn't ask for any of this. Fallback: consent only for changes that specifically hurt Northvane's SAFE, with the side letter ending at the Series A (like the YC letter).</w:t>
+                <w:rFonts w:ascii="Times New Roman" w:hAnsi="Times New Roman" w:cs="Times New Roman" w:eastAsia="Times New Roman"/>
+                <w:sz w:val="24"/>
+                <w:szCs w:val="24"/>
+              </w:rPr>
+              <w:t xml:space="preserve">Delete them, or at most limit them to changes that directly hurt Northvane's SAFE.</w:t>
             </w:r>
           </w:p>
         </w:tc>
@@ -2964,8 +2242,9 @@
           <w:p>
             <w:r>
               <w:rPr>
-                <w:sz w:val="20"/>
-                <w:szCs w:val="20"/>
+                <w:rFonts w:ascii="Times New Roman" w:hAnsi="Times New Roman" w:cs="Times New Roman" w:eastAsia="Times New Roman"/>
+                <w:sz w:val="24"/>
+                <w:szCs w:val="24"/>
               </w:rPr>
               <w:t xml:space="preserve">1</w:t>
             </w:r>
@@ -2990,19 +2269,11 @@
           <w:p>
             <w:r>
               <w:rPr>
-                <w:b/>
-                <w:bCs/>
-                <w:sz w:val="20"/>
-                <w:szCs w:val="20"/>
-              </w:rPr>
-              <w:t xml:space="preserve">$1 put option.</w:t>
-            </w:r>
-            <w:r>
-              <w:rPr>
-                <w:sz w:val="20"/>
-                <w:szCs w:val="20"/>
-              </w:rPr>
-              <w:t xml:space="preserve"> Side letter §12</w:t>
+                <w:rFonts w:ascii="Times New Roman" w:hAnsi="Times New Roman" w:cs="Times New Roman" w:eastAsia="Times New Roman"/>
+                <w:sz w:val="24"/>
+                <w:szCs w:val="24"/>
+              </w:rPr>
+              <w:t xml:space="preserve">$1 put option. (Side letter §12)</w:t>
             </w:r>
           </w:p>
         </w:tc>
@@ -3025,10 +2296,11 @@
           <w:p>
             <w:r>
               <w:rPr>
-                <w:sz w:val="20"/>
-                <w:szCs w:val="20"/>
-              </w:rPr>
-              <w:t xml:space="preserve">It looks scary, but it only lets Northvane hand its stake back to the company for $1. The company loses nothing and gets the shares back. Funds use this to book a tax loss.</w:t>
+                <w:rFonts w:ascii="Times New Roman" w:hAnsi="Times New Roman" w:cs="Times New Roman" w:eastAsia="Times New Roman"/>
+                <w:sz w:val="24"/>
+                <w:szCs w:val="24"/>
+              </w:rPr>
+              <w:t xml:space="preserve">It just lets Northvane hand its stake back for $1, which costs us nothing. Funds use it to take a tax loss.</w:t>
             </w:r>
           </w:p>
         </w:tc>
@@ -3062,8 +2334,9 @@
           <w:p>
             <w:r>
               <w:rPr>
-                <w:sz w:val="20"/>
-                <w:szCs w:val="20"/>
+                <w:rFonts w:ascii="Times New Roman" w:hAnsi="Times New Roman" w:cs="Times New Roman" w:eastAsia="Times New Roman"/>
+                <w:sz w:val="24"/>
+                <w:szCs w:val="24"/>
               </w:rPr>
               <w:t xml:space="preserve">2</w:t>
             </w:r>
@@ -3088,19 +2361,11 @@
           <w:p>
             <w:r>
               <w:rPr>
-                <w:b/>
-                <w:bCs/>
-                <w:sz w:val="20"/>
-                <w:szCs w:val="20"/>
-              </w:rPr>
-              <w:t xml:space="preserve">QSBS tax reps.</w:t>
-            </w:r>
-            <w:r>
-              <w:rPr>
-                <w:sz w:val="20"/>
-                <w:szCs w:val="20"/>
-              </w:rPr>
-              <w:t xml:space="preserve"> Side letter §10</w:t>
+                <w:rFonts w:ascii="Times New Roman" w:hAnsi="Times New Roman" w:cs="Times New Roman" w:eastAsia="Times New Roman"/>
+                <w:sz w:val="24"/>
+                <w:szCs w:val="24"/>
+              </w:rPr>
+              <w:t xml:space="preserve">QSBS tax reps. (Side letter §10)</w:t>
             </w:r>
           </w:p>
         </w:tc>
@@ -3123,10 +2388,11 @@
           <w:p>
             <w:r>
               <w:rPr>
-                <w:sz w:val="20"/>
-                <w:szCs w:val="20"/>
-              </w:rPr>
-              <w:t xml:space="preserve">They help the founders too (tax-free gains on a sale). They should be true for Tinsmith, and the promise is only "reasonable efforts."</w:t>
+                <w:rFonts w:ascii="Times New Roman" w:hAnsi="Times New Roman" w:cs="Times New Roman" w:eastAsia="Times New Roman"/>
+                <w:sz w:val="24"/>
+                <w:szCs w:val="24"/>
+              </w:rPr>
+              <w:t xml:space="preserve">These help the founders too, since they protect tax-free gains on a sale. They should already be true for Tinsmith.</w:t>
             </w:r>
           </w:p>
         </w:tc>
@@ -3235,10 +2501,11 @@
           <w:p>
             <w:r>
               <w:rPr>
-                <w:sz w:val="20"/>
-                <w:szCs w:val="20"/>
-              </w:rPr>
-              <w:t xml:space="preserve">If Dana won't drop the SAFE changes and the founder re-vesting, would Bramblewood lead or put in more so you can close without Northvane? (Tells us how hard we can push.)</w:t>
+                <w:rFonts w:ascii="Times New Roman" w:hAnsi="Times New Roman" w:cs="Times New Roman" w:eastAsia="Times New Roman"/>
+                <w:sz w:val="24"/>
+                <w:szCs w:val="24"/>
+              </w:rPr>
+              <w:t xml:space="preserve">If Dana won't budge, would Bramblewood step up and lead so you can close without Northvane? That tells us how hard we can push.</w:t>
             </w:r>
           </w:p>
         </w:tc>

</xml_diff>